<commit_message>
added login and user based UI
</commit_message>
<xml_diff>
--- a/About project.docx
+++ b/About project.docx
@@ -19,8 +19,31 @@
         </w:numPr>
         <w:ind w:left="-207"/>
       </w:pPr>
-      <w:r>
-        <w:t>npm init -y. This command creates a file package.json inside your project.</w:t>
+      <w:proofErr w:type="spellStart"/>
+      <w:r>
+        <w:t>npm</w:t>
+      </w:r>
+      <w:proofErr w:type="spellEnd"/>
+      <w:r>
+        <w:t xml:space="preserve"> </w:t>
+      </w:r>
+      <w:proofErr w:type="spellStart"/>
+      <w:r>
+        <w:t>init</w:t>
+      </w:r>
+      <w:proofErr w:type="spellEnd"/>
+      <w:r>
+        <w:t xml:space="preserve"> -y. This command creates a file </w:t>
+      </w:r>
+      <w:proofErr w:type="spellStart"/>
+      <w:proofErr w:type="gramStart"/>
+      <w:r>
+        <w:t>package.json</w:t>
+      </w:r>
+      <w:proofErr w:type="spellEnd"/>
+      <w:proofErr w:type="gramEnd"/>
+      <w:r>
+        <w:t xml:space="preserve"> inside your project.</w:t>
       </w:r>
     </w:p>
     <w:p>
@@ -32,8 +55,13 @@
       </w:r>
     </w:p>
     <w:p>
-      <w:r>
-        <w:t>Package.json is like a list of:</w:t>
+      <w:proofErr w:type="spellStart"/>
+      <w:r>
+        <w:t>Package.json</w:t>
+      </w:r>
+      <w:proofErr w:type="spellEnd"/>
+      <w:r>
+        <w:t xml:space="preserve"> is like a list of:</w:t>
       </w:r>
     </w:p>
     <w:p>
@@ -81,8 +109,21 @@
         </w:numPr>
         <w:ind w:left="-207"/>
       </w:pPr>
-      <w:r>
-        <w:t>npm install mysql2 readline-sync</w:t>
+      <w:proofErr w:type="spellStart"/>
+      <w:r>
+        <w:t>npm</w:t>
+      </w:r>
+      <w:proofErr w:type="spellEnd"/>
+      <w:r>
+        <w:t xml:space="preserve"> install mysql2 </w:t>
+      </w:r>
+      <w:proofErr w:type="spellStart"/>
+      <w:r>
+        <w:t>readline</w:t>
+      </w:r>
+      <w:proofErr w:type="spellEnd"/>
+      <w:r>
+        <w:t>-sync</w:t>
       </w:r>
       <w:r>
         <w:t>:</w:t>
@@ -145,6 +186,7 @@
           <w14:ligatures w14:val="none"/>
         </w:rPr>
       </w:pPr>
+      <w:proofErr w:type="spellStart"/>
       <w:r>
         <w:rPr>
           <w:rFonts w:eastAsia="Times New Roman" w:cstheme="minorHAnsi"/>
@@ -154,7 +196,19 @@
           <w:lang w:eastAsia="en-IN"/>
           <w14:ligatures w14:val="none"/>
         </w:rPr>
-        <w:t xml:space="preserve">readline-sync - </w:t>
+        <w:t>readline</w:t>
+      </w:r>
+      <w:proofErr w:type="spellEnd"/>
+      <w:r>
+        <w:rPr>
+          <w:rFonts w:eastAsia="Times New Roman" w:cstheme="minorHAnsi"/>
+          <w:b/>
+          <w:bCs/>
+          <w:kern w:val="0"/>
+          <w:lang w:eastAsia="en-IN"/>
+          <w14:ligatures w14:val="none"/>
+        </w:rPr>
+        <w:t xml:space="preserve">-sync - </w:t>
       </w:r>
       <w:r>
         <w:rPr>
@@ -221,6 +275,7 @@
           <w14:ligatures w14:val="none"/>
         </w:rPr>
       </w:pPr>
+      <w:proofErr w:type="spellStart"/>
       <w:r>
         <w:rPr>
           <w:rFonts w:eastAsia="Times New Roman" w:cstheme="minorHAnsi"/>
@@ -228,8 +283,29 @@
           <w:lang w:eastAsia="en-IN"/>
           <w14:ligatures w14:val="none"/>
         </w:rPr>
-        <w:t>npm install express mysql2 body-parser cors</w:t>
-      </w:r>
+        <w:t>npm</w:t>
+      </w:r>
+      <w:proofErr w:type="spellEnd"/>
+      <w:r>
+        <w:rPr>
+          <w:rFonts w:eastAsia="Times New Roman" w:cstheme="minorHAnsi"/>
+          <w:kern w:val="0"/>
+          <w:lang w:eastAsia="en-IN"/>
+          <w14:ligatures w14:val="none"/>
+        </w:rPr>
+        <w:t xml:space="preserve"> install express mysql2 body-parser </w:t>
+      </w:r>
+      <w:proofErr w:type="spellStart"/>
+      <w:r>
+        <w:rPr>
+          <w:rFonts w:eastAsia="Times New Roman" w:cstheme="minorHAnsi"/>
+          <w:kern w:val="0"/>
+          <w:lang w:eastAsia="en-IN"/>
+          <w14:ligatures w14:val="none"/>
+        </w:rPr>
+        <w:t>cors</w:t>
+      </w:r>
+      <w:proofErr w:type="spellEnd"/>
     </w:p>
     <w:p>
       <w:pPr>
@@ -325,6 +401,7 @@
           <w14:ligatures w14:val="none"/>
         </w:rPr>
       </w:pPr>
+      <w:proofErr w:type="spellStart"/>
       <w:r>
         <w:rPr>
           <w:rFonts w:eastAsia="Times New Roman" w:cstheme="minorHAnsi"/>
@@ -332,7 +409,17 @@
           <w:lang w:eastAsia="en-IN"/>
           <w14:ligatures w14:val="none"/>
         </w:rPr>
-        <w:t>cors → allows your HTML (frontend) to talk to backend.</w:t>
+        <w:t>cors</w:t>
+      </w:r>
+      <w:proofErr w:type="spellEnd"/>
+      <w:r>
+        <w:rPr>
+          <w:rFonts w:eastAsia="Times New Roman" w:cstheme="minorHAnsi"/>
+          <w:kern w:val="0"/>
+          <w:lang w:eastAsia="en-IN"/>
+          <w14:ligatures w14:val="none"/>
+        </w:rPr>
+        <w:t xml:space="preserve"> → allows your HTML (frontend) to talk to backend.</w:t>
       </w:r>
     </w:p>
     <w:p>
@@ -345,16 +432,21 @@
         <w:ind w:left="-207"/>
       </w:pPr>
       <w:r>
-        <w:t>F</w:t>
-      </w:r>
-      <w:r>
-        <w:t>etch</w:t>
+        <w:t>Fetch</w:t>
       </w:r>
       <w:r>
         <w:t xml:space="preserve"> </w:t>
       </w:r>
       <w:r>
-        <w:t>('http://localhost:3000/addStudent', {...})</w:t>
+        <w:t>('http://localhost:3000/</w:t>
+      </w:r>
+      <w:proofErr w:type="spellStart"/>
+      <w:r>
+        <w:t>addStudent</w:t>
+      </w:r>
+      <w:proofErr w:type="spellEnd"/>
+      <w:r>
+        <w:t>', {...})</w:t>
       </w:r>
       <w:r>
         <w:t xml:space="preserve"> this sends a message to node.js server telling to add a student because it was called while adding a student so.</w:t>
@@ -395,14 +487,23 @@
           <w:b/>
           <w:bCs/>
         </w:rPr>
-        <w:t>headers: {'Content-Type': 'application/json'}</w:t>
-      </w:r>
-      <w:r>
-        <w:rPr>
-          <w:b/>
-          <w:bCs/>
-        </w:rPr>
-        <w:t>:</w:t>
+        <w:t>headers: {'Content-Type': 'application/</w:t>
+      </w:r>
+      <w:proofErr w:type="spellStart"/>
+      <w:r>
+        <w:rPr>
+          <w:b/>
+          <w:bCs/>
+        </w:rPr>
+        <w:t>json</w:t>
+      </w:r>
+      <w:proofErr w:type="spellEnd"/>
+      <w:r>
+        <w:rPr>
+          <w:b/>
+          <w:bCs/>
+        </w:rPr>
+        <w:t>'}:</w:t>
       </w:r>
       <w:r>
         <w:t xml:space="preserve"> form is sending data is mentioned here </w:t>
@@ -421,14 +522,39 @@
           <w:b/>
           <w:bCs/>
         </w:rPr>
-        <w:t>body: JSON.stringify({roll_no: roll, name: name, branch: branch})</w:t>
-      </w:r>
-      <w:r>
-        <w:rPr>
-          <w:b/>
-          <w:bCs/>
-        </w:rPr>
-        <w:t>:</w:t>
+        <w:t xml:space="preserve">body: </w:t>
+      </w:r>
+      <w:proofErr w:type="spellStart"/>
+      <w:r>
+        <w:rPr>
+          <w:b/>
+          <w:bCs/>
+        </w:rPr>
+        <w:t>JSON.stringify</w:t>
+      </w:r>
+      <w:proofErr w:type="spellEnd"/>
+      <w:r>
+        <w:rPr>
+          <w:b/>
+          <w:bCs/>
+        </w:rPr>
+        <w:t>({</w:t>
+      </w:r>
+      <w:proofErr w:type="spellStart"/>
+      <w:r>
+        <w:rPr>
+          <w:b/>
+          <w:bCs/>
+        </w:rPr>
+        <w:t>roll_no</w:t>
+      </w:r>
+      <w:proofErr w:type="spellEnd"/>
+      <w:r>
+        <w:rPr>
+          <w:b/>
+          <w:bCs/>
+        </w:rPr>
+        <w:t>: roll, name: name, branch: branch}):</w:t>
       </w:r>
       <w:r>
         <w:t xml:space="preserve"> data is mentioned here, the roll number, name, branch</w:t>
@@ -449,22 +575,50 @@
           <w:bCs/>
         </w:rPr>
       </w:pPr>
-      <w:r>
-        <w:rPr>
-          <w:b/>
-          <w:bCs/>
-        </w:rPr>
-        <w:t>.then(res =&gt; res.json())</w:t>
-      </w:r>
-      <w:r>
-        <w:rPr>
-          <w:b/>
-          <w:bCs/>
-        </w:rPr>
-        <w:t xml:space="preserve">: </w:t>
-      </w:r>
-      <w:r>
-        <w:t>this is sent by server telling whatever I am sending convert into json to understand</w:t>
+      <w:proofErr w:type="gramStart"/>
+      <w:r>
+        <w:rPr>
+          <w:b/>
+          <w:bCs/>
+        </w:rPr>
+        <w:t>.then</w:t>
+      </w:r>
+      <w:proofErr w:type="gramEnd"/>
+      <w:r>
+        <w:rPr>
+          <w:b/>
+          <w:bCs/>
+        </w:rPr>
+        <w:t xml:space="preserve">(res =&gt; </w:t>
+      </w:r>
+      <w:proofErr w:type="spellStart"/>
+      <w:proofErr w:type="gramStart"/>
+      <w:r>
+        <w:rPr>
+          <w:b/>
+          <w:bCs/>
+        </w:rPr>
+        <w:t>res.json</w:t>
+      </w:r>
+      <w:proofErr w:type="spellEnd"/>
+      <w:proofErr w:type="gramEnd"/>
+      <w:r>
+        <w:rPr>
+          <w:b/>
+          <w:bCs/>
+        </w:rPr>
+        <w:t xml:space="preserve">()): </w:t>
+      </w:r>
+      <w:r>
+        <w:t xml:space="preserve">this is sent by server telling whatever I am sending convert into </w:t>
+      </w:r>
+      <w:proofErr w:type="spellStart"/>
+      <w:r>
+        <w:t>json</w:t>
+      </w:r>
+      <w:proofErr w:type="spellEnd"/>
+      <w:r>
+        <w:t xml:space="preserve"> to understand</w:t>
       </w:r>
       <w:r>
         <w:t>.</w:t>
@@ -482,12 +636,37 @@
           <w:bCs/>
         </w:rPr>
       </w:pPr>
-      <w:r>
-        <w:rPr>
-          <w:b/>
-          <w:bCs/>
-        </w:rPr>
-        <w:t>.then(data =&gt; { ... })</w:t>
+      <w:proofErr w:type="gramStart"/>
+      <w:r>
+        <w:rPr>
+          <w:b/>
+          <w:bCs/>
+        </w:rPr>
+        <w:t>.then</w:t>
+      </w:r>
+      <w:proofErr w:type="gramEnd"/>
+      <w:r>
+        <w:rPr>
+          <w:b/>
+          <w:bCs/>
+        </w:rPr>
+        <w:t xml:space="preserve">(data =&gt; </w:t>
+      </w:r>
+      <w:proofErr w:type="gramStart"/>
+      <w:r>
+        <w:rPr>
+          <w:b/>
+          <w:bCs/>
+        </w:rPr>
+        <w:t>{ ...</w:t>
+      </w:r>
+      <w:proofErr w:type="gramEnd"/>
+      <w:r>
+        <w:rPr>
+          <w:b/>
+          <w:bCs/>
+        </w:rPr>
+        <w:t xml:space="preserve"> })</w:t>
       </w:r>
       <w:r>
         <w:rPr>
@@ -498,6 +677,1953 @@
       </w:r>
       <w:r>
         <w:t>data sent is printed or added where it has to be done</w:t>
+      </w:r>
+    </w:p>
+    <w:p>
+      <w:pPr>
+        <w:ind w:left="-567"/>
+        <w:rPr>
+          <w:b/>
+          <w:bCs/>
+        </w:rPr>
+      </w:pPr>
+      <w:r>
+        <w:rPr>
+          <w:b/>
+          <w:bCs/>
+        </w:rPr>
+        <w:t>Here’s a clear walkthrough of the app flow from the first page onward.</w:t>
+      </w:r>
+    </w:p>
+    <w:p>
+      <w:pPr>
+        <w:numPr>
+          <w:ilvl w:val="0"/>
+          <w:numId w:val="8"/>
+        </w:numPr>
+        <w:spacing w:after="0"/>
+        <w:rPr>
+          <w:b/>
+          <w:bCs/>
+        </w:rPr>
+      </w:pPr>
+      <w:r>
+        <w:rPr>
+          <w:b/>
+          <w:bCs/>
+        </w:rPr>
+        <w:t>First page: Login / Sign up</w:t>
+      </w:r>
+      <w:r>
+        <w:rPr>
+          <w:b/>
+          <w:bCs/>
+        </w:rPr>
+        <w:br/>
+        <w:t>From the opening page, you can:</w:t>
+      </w:r>
+    </w:p>
+    <w:p>
+      <w:pPr>
+        <w:numPr>
+          <w:ilvl w:val="0"/>
+          <w:numId w:val="9"/>
+        </w:numPr>
+        <w:spacing w:after="0"/>
+        <w:rPr>
+          <w:b/>
+          <w:bCs/>
+        </w:rPr>
+      </w:pPr>
+      <w:r>
+        <w:rPr>
+          <w:b/>
+          <w:bCs/>
+        </w:rPr>
+        <w:t>Choose your role: Doctor or Student</w:t>
+      </w:r>
+    </w:p>
+    <w:p>
+      <w:pPr>
+        <w:numPr>
+          <w:ilvl w:val="0"/>
+          <w:numId w:val="9"/>
+        </w:numPr>
+        <w:spacing w:after="0"/>
+        <w:rPr>
+          <w:b/>
+          <w:bCs/>
+        </w:rPr>
+      </w:pPr>
+      <w:r>
+        <w:rPr>
+          <w:b/>
+          <w:bCs/>
+        </w:rPr>
+        <w:t>Sign up for a new account</w:t>
+      </w:r>
+    </w:p>
+    <w:p>
+      <w:pPr>
+        <w:numPr>
+          <w:ilvl w:val="0"/>
+          <w:numId w:val="9"/>
+        </w:numPr>
+        <w:spacing w:after="0"/>
+        <w:rPr>
+          <w:b/>
+          <w:bCs/>
+        </w:rPr>
+      </w:pPr>
+      <w:r>
+        <w:rPr>
+          <w:b/>
+          <w:bCs/>
+        </w:rPr>
+        <w:t>Log in with an existing account</w:t>
+      </w:r>
+    </w:p>
+    <w:p>
+      <w:pPr>
+        <w:numPr>
+          <w:ilvl w:val="0"/>
+          <w:numId w:val="9"/>
+        </w:numPr>
+        <w:spacing w:after="0"/>
+        <w:rPr>
+          <w:b/>
+          <w:bCs/>
+        </w:rPr>
+      </w:pPr>
+      <w:r>
+        <w:rPr>
+          <w:b/>
+          <w:bCs/>
+        </w:rPr>
+        <w:t>Enter a roll number during signup/login for student access</w:t>
+      </w:r>
+    </w:p>
+    <w:p>
+      <w:pPr>
+        <w:numPr>
+          <w:ilvl w:val="0"/>
+          <w:numId w:val="9"/>
+        </w:numPr>
+        <w:spacing w:after="0"/>
+        <w:rPr>
+          <w:b/>
+          <w:bCs/>
+        </w:rPr>
+      </w:pPr>
+      <w:r>
+        <w:rPr>
+          <w:b/>
+          <w:bCs/>
+        </w:rPr>
+        <w:t>Use the same username and password later to log in</w:t>
+      </w:r>
+    </w:p>
+    <w:p>
+      <w:pPr>
+        <w:numPr>
+          <w:ilvl w:val="0"/>
+          <w:numId w:val="10"/>
+        </w:numPr>
+        <w:spacing w:after="0"/>
+        <w:rPr>
+          <w:b/>
+          <w:bCs/>
+        </w:rPr>
+      </w:pPr>
+      <w:r>
+        <w:rPr>
+          <w:b/>
+          <w:bCs/>
+        </w:rPr>
+        <w:t>After Doctor login</w:t>
+      </w:r>
+      <w:r>
+        <w:rPr>
+          <w:b/>
+          <w:bCs/>
+        </w:rPr>
+        <w:br/>
+        <w:t>Once a doctor logs in, they reach the dashboard and can:</w:t>
+      </w:r>
+    </w:p>
+    <w:p>
+      <w:pPr>
+        <w:numPr>
+          <w:ilvl w:val="0"/>
+          <w:numId w:val="11"/>
+        </w:numPr>
+        <w:spacing w:after="0"/>
+        <w:rPr>
+          <w:b/>
+          <w:bCs/>
+        </w:rPr>
+      </w:pPr>
+      <w:r>
+        <w:rPr>
+          <w:b/>
+          <w:bCs/>
+        </w:rPr>
+        <w:t>Add a new student</w:t>
+      </w:r>
+    </w:p>
+    <w:p>
+      <w:pPr>
+        <w:numPr>
+          <w:ilvl w:val="0"/>
+          <w:numId w:val="11"/>
+        </w:numPr>
+        <w:spacing w:after="0"/>
+        <w:rPr>
+          <w:b/>
+          <w:bCs/>
+        </w:rPr>
+      </w:pPr>
+      <w:r>
+        <w:rPr>
+          <w:b/>
+          <w:bCs/>
+        </w:rPr>
+        <w:t>Add a new health record</w:t>
+      </w:r>
+    </w:p>
+    <w:p>
+      <w:pPr>
+        <w:numPr>
+          <w:ilvl w:val="0"/>
+          <w:numId w:val="11"/>
+        </w:numPr>
+        <w:spacing w:after="0"/>
+        <w:rPr>
+          <w:b/>
+          <w:bCs/>
+        </w:rPr>
+      </w:pPr>
+      <w:r>
+        <w:rPr>
+          <w:b/>
+          <w:bCs/>
+        </w:rPr>
+        <w:t>View health records</w:t>
+      </w:r>
+    </w:p>
+    <w:p>
+      <w:pPr>
+        <w:numPr>
+          <w:ilvl w:val="0"/>
+          <w:numId w:val="11"/>
+        </w:numPr>
+        <w:spacing w:after="0"/>
+        <w:rPr>
+          <w:b/>
+          <w:bCs/>
+        </w:rPr>
+      </w:pPr>
+      <w:r>
+        <w:rPr>
+          <w:b/>
+          <w:bCs/>
+        </w:rPr>
+        <w:t>Open a student’s record quickly by entering a roll number</w:t>
+      </w:r>
+    </w:p>
+    <w:p>
+      <w:pPr>
+        <w:numPr>
+          <w:ilvl w:val="0"/>
+          <w:numId w:val="11"/>
+        </w:numPr>
+        <w:spacing w:after="0"/>
+        <w:rPr>
+          <w:b/>
+          <w:bCs/>
+        </w:rPr>
+      </w:pPr>
+      <w:r>
+        <w:rPr>
+          <w:b/>
+          <w:bCs/>
+        </w:rPr>
+        <w:t>Logout</w:t>
+      </w:r>
+    </w:p>
+    <w:p>
+      <w:pPr>
+        <w:numPr>
+          <w:ilvl w:val="0"/>
+          <w:numId w:val="12"/>
+        </w:numPr>
+        <w:spacing w:after="0"/>
+        <w:rPr>
+          <w:b/>
+          <w:bCs/>
+        </w:rPr>
+      </w:pPr>
+      <w:r>
+        <w:rPr>
+          <w:b/>
+          <w:bCs/>
+        </w:rPr>
+        <w:t>After Student login</w:t>
+      </w:r>
+      <w:r>
+        <w:rPr>
+          <w:b/>
+          <w:bCs/>
+        </w:rPr>
+        <w:br/>
+        <w:t>Once a student logs in, they can:</w:t>
+      </w:r>
+    </w:p>
+    <w:p>
+      <w:pPr>
+        <w:numPr>
+          <w:ilvl w:val="0"/>
+          <w:numId w:val="13"/>
+        </w:numPr>
+        <w:spacing w:after="0"/>
+        <w:rPr>
+          <w:b/>
+          <w:bCs/>
+        </w:rPr>
+      </w:pPr>
+      <w:r>
+        <w:rPr>
+          <w:b/>
+          <w:bCs/>
+        </w:rPr>
+        <w:t>View their own health records</w:t>
+      </w:r>
+    </w:p>
+    <w:p>
+      <w:pPr>
+        <w:numPr>
+          <w:ilvl w:val="0"/>
+          <w:numId w:val="13"/>
+        </w:numPr>
+        <w:spacing w:after="0"/>
+        <w:rPr>
+          <w:b/>
+          <w:bCs/>
+        </w:rPr>
+      </w:pPr>
+      <w:r>
+        <w:rPr>
+          <w:b/>
+          <w:bCs/>
+        </w:rPr>
+        <w:t>See the records linked to their roll number</w:t>
+      </w:r>
+    </w:p>
+    <w:p>
+      <w:pPr>
+        <w:numPr>
+          <w:ilvl w:val="0"/>
+          <w:numId w:val="13"/>
+        </w:numPr>
+        <w:spacing w:after="0"/>
+        <w:rPr>
+          <w:b/>
+          <w:bCs/>
+        </w:rPr>
+      </w:pPr>
+      <w:r>
+        <w:rPr>
+          <w:b/>
+          <w:bCs/>
+        </w:rPr>
+        <w:t>Logout</w:t>
+      </w:r>
+    </w:p>
+    <w:p>
+      <w:pPr>
+        <w:numPr>
+          <w:ilvl w:val="0"/>
+          <w:numId w:val="14"/>
+        </w:numPr>
+        <w:spacing w:after="0"/>
+        <w:rPr>
+          <w:b/>
+          <w:bCs/>
+        </w:rPr>
+      </w:pPr>
+      <w:r>
+        <w:rPr>
+          <w:b/>
+          <w:bCs/>
+        </w:rPr>
+        <w:lastRenderedPageBreak/>
+        <w:t>Add Student page</w:t>
+      </w:r>
+      <w:r>
+        <w:rPr>
+          <w:b/>
+          <w:bCs/>
+        </w:rPr>
+        <w:br/>
+        <w:t>From this page, the doctor can:</w:t>
+      </w:r>
+    </w:p>
+    <w:p>
+      <w:pPr>
+        <w:numPr>
+          <w:ilvl w:val="0"/>
+          <w:numId w:val="15"/>
+        </w:numPr>
+        <w:spacing w:after="0"/>
+        <w:rPr>
+          <w:b/>
+          <w:bCs/>
+        </w:rPr>
+      </w:pPr>
+      <w:r>
+        <w:rPr>
+          <w:b/>
+          <w:bCs/>
+        </w:rPr>
+        <w:t>Enter student roll number</w:t>
+      </w:r>
+    </w:p>
+    <w:p>
+      <w:pPr>
+        <w:numPr>
+          <w:ilvl w:val="0"/>
+          <w:numId w:val="15"/>
+        </w:numPr>
+        <w:spacing w:after="0"/>
+        <w:rPr>
+          <w:b/>
+          <w:bCs/>
+        </w:rPr>
+      </w:pPr>
+      <w:r>
+        <w:rPr>
+          <w:b/>
+          <w:bCs/>
+        </w:rPr>
+        <w:t>Enter student name</w:t>
+      </w:r>
+    </w:p>
+    <w:p>
+      <w:pPr>
+        <w:numPr>
+          <w:ilvl w:val="0"/>
+          <w:numId w:val="15"/>
+        </w:numPr>
+        <w:spacing w:after="0"/>
+        <w:rPr>
+          <w:b/>
+          <w:bCs/>
+        </w:rPr>
+      </w:pPr>
+      <w:r>
+        <w:rPr>
+          <w:b/>
+          <w:bCs/>
+        </w:rPr>
+        <w:t>Enter branch</w:t>
+      </w:r>
+    </w:p>
+    <w:p>
+      <w:pPr>
+        <w:numPr>
+          <w:ilvl w:val="0"/>
+          <w:numId w:val="15"/>
+        </w:numPr>
+        <w:spacing w:after="0"/>
+        <w:rPr>
+          <w:b/>
+          <w:bCs/>
+        </w:rPr>
+      </w:pPr>
+      <w:r>
+        <w:rPr>
+          <w:b/>
+          <w:bCs/>
+        </w:rPr>
+        <w:t>Save the student into the system</w:t>
+      </w:r>
+    </w:p>
+    <w:p>
+      <w:pPr>
+        <w:numPr>
+          <w:ilvl w:val="0"/>
+          <w:numId w:val="16"/>
+        </w:numPr>
+        <w:spacing w:after="0"/>
+        <w:rPr>
+          <w:b/>
+          <w:bCs/>
+        </w:rPr>
+      </w:pPr>
+      <w:r>
+        <w:rPr>
+          <w:b/>
+          <w:bCs/>
+        </w:rPr>
+        <w:t>Add Health Record page</w:t>
+      </w:r>
+      <w:r>
+        <w:rPr>
+          <w:b/>
+          <w:bCs/>
+        </w:rPr>
+        <w:br/>
+        <w:t>From this page, the doctor can:</w:t>
+      </w:r>
+    </w:p>
+    <w:p>
+      <w:pPr>
+        <w:numPr>
+          <w:ilvl w:val="0"/>
+          <w:numId w:val="17"/>
+        </w:numPr>
+        <w:spacing w:after="0"/>
+        <w:rPr>
+          <w:b/>
+          <w:bCs/>
+        </w:rPr>
+      </w:pPr>
+      <w:r>
+        <w:rPr>
+          <w:b/>
+          <w:bCs/>
+        </w:rPr>
+        <w:t>Enter the student roll number</w:t>
+      </w:r>
+    </w:p>
+    <w:p>
+      <w:pPr>
+        <w:numPr>
+          <w:ilvl w:val="0"/>
+          <w:numId w:val="17"/>
+        </w:numPr>
+        <w:spacing w:after="0"/>
+        <w:rPr>
+          <w:b/>
+          <w:bCs/>
+        </w:rPr>
+      </w:pPr>
+      <w:r>
+        <w:rPr>
+          <w:b/>
+          <w:bCs/>
+        </w:rPr>
+        <w:t>Enter symptoms</w:t>
+      </w:r>
+    </w:p>
+    <w:p>
+      <w:pPr>
+        <w:numPr>
+          <w:ilvl w:val="0"/>
+          <w:numId w:val="17"/>
+        </w:numPr>
+        <w:spacing w:after="0"/>
+        <w:rPr>
+          <w:b/>
+          <w:bCs/>
+        </w:rPr>
+      </w:pPr>
+      <w:r>
+        <w:rPr>
+          <w:b/>
+          <w:bCs/>
+        </w:rPr>
+        <w:t>Select the date of visit</w:t>
+      </w:r>
+    </w:p>
+    <w:p>
+      <w:pPr>
+        <w:numPr>
+          <w:ilvl w:val="0"/>
+          <w:numId w:val="17"/>
+        </w:numPr>
+        <w:spacing w:after="0"/>
+        <w:rPr>
+          <w:b/>
+          <w:bCs/>
+        </w:rPr>
+      </w:pPr>
+      <w:r>
+        <w:rPr>
+          <w:b/>
+          <w:bCs/>
+        </w:rPr>
+        <w:t>Add one or more medicines in the prescription section</w:t>
+      </w:r>
+    </w:p>
+    <w:p>
+      <w:pPr>
+        <w:numPr>
+          <w:ilvl w:val="0"/>
+          <w:numId w:val="17"/>
+        </w:numPr>
+        <w:spacing w:after="0"/>
+        <w:rPr>
+          <w:b/>
+          <w:bCs/>
+        </w:rPr>
+      </w:pPr>
+      <w:r>
+        <w:rPr>
+          <w:b/>
+          <w:bCs/>
+        </w:rPr>
+        <w:t>Save the health record</w:t>
+      </w:r>
+    </w:p>
+    <w:p>
+      <w:pPr>
+        <w:numPr>
+          <w:ilvl w:val="0"/>
+          <w:numId w:val="18"/>
+        </w:numPr>
+        <w:spacing w:after="0"/>
+        <w:rPr>
+          <w:b/>
+          <w:bCs/>
+        </w:rPr>
+      </w:pPr>
+      <w:r>
+        <w:rPr>
+          <w:b/>
+          <w:bCs/>
+        </w:rPr>
+        <w:t>View Health Records page</w:t>
+      </w:r>
+      <w:r>
+        <w:rPr>
+          <w:b/>
+          <w:bCs/>
+        </w:rPr>
+        <w:br/>
+        <w:t>From this page, the doctor or student can:</w:t>
+      </w:r>
+    </w:p>
+    <w:p>
+      <w:pPr>
+        <w:numPr>
+          <w:ilvl w:val="0"/>
+          <w:numId w:val="19"/>
+        </w:numPr>
+        <w:spacing w:after="0"/>
+        <w:rPr>
+          <w:b/>
+          <w:bCs/>
+        </w:rPr>
+      </w:pPr>
+      <w:r>
+        <w:rPr>
+          <w:b/>
+          <w:bCs/>
+        </w:rPr>
+        <w:t>Enter a roll number</w:t>
+      </w:r>
+    </w:p>
+    <w:p>
+      <w:pPr>
+        <w:numPr>
+          <w:ilvl w:val="0"/>
+          <w:numId w:val="19"/>
+        </w:numPr>
+        <w:spacing w:after="0"/>
+        <w:rPr>
+          <w:b/>
+          <w:bCs/>
+        </w:rPr>
+      </w:pPr>
+      <w:r>
+        <w:rPr>
+          <w:b/>
+          <w:bCs/>
+        </w:rPr>
+        <w:t>View all health records for that student</w:t>
+      </w:r>
+    </w:p>
+    <w:p>
+      <w:pPr>
+        <w:numPr>
+          <w:ilvl w:val="0"/>
+          <w:numId w:val="19"/>
+        </w:numPr>
+        <w:spacing w:after="0"/>
+        <w:rPr>
+          <w:b/>
+          <w:bCs/>
+        </w:rPr>
+      </w:pPr>
+      <w:r>
+        <w:rPr>
+          <w:b/>
+          <w:bCs/>
+        </w:rPr>
+        <w:t>Open prescription details in a popup</w:t>
+      </w:r>
+    </w:p>
+    <w:p>
+      <w:pPr>
+        <w:numPr>
+          <w:ilvl w:val="0"/>
+          <w:numId w:val="19"/>
+        </w:numPr>
+        <w:spacing w:after="0"/>
+        <w:rPr>
+          <w:b/>
+          <w:bCs/>
+        </w:rPr>
+      </w:pPr>
+      <w:r>
+        <w:rPr>
+          <w:b/>
+          <w:bCs/>
+        </w:rPr>
+        <w:t>Go back to the dashboard or logout</w:t>
+      </w:r>
+    </w:p>
+    <w:p>
+      <w:pPr>
+        <w:numPr>
+          <w:ilvl w:val="0"/>
+          <w:numId w:val="20"/>
+        </w:numPr>
+        <w:spacing w:after="0"/>
+        <w:rPr>
+          <w:b/>
+          <w:bCs/>
+        </w:rPr>
+      </w:pPr>
+      <w:r>
+        <w:rPr>
+          <w:b/>
+          <w:bCs/>
+        </w:rPr>
+        <w:t>Dashboard page</w:t>
+      </w:r>
+      <w:r>
+        <w:rPr>
+          <w:b/>
+          <w:bCs/>
+        </w:rPr>
+        <w:br/>
+        <w:t>The dashboard shows:</w:t>
+      </w:r>
+    </w:p>
+    <w:p>
+      <w:pPr>
+        <w:numPr>
+          <w:ilvl w:val="0"/>
+          <w:numId w:val="21"/>
+        </w:numPr>
+        <w:spacing w:after="0"/>
+        <w:rPr>
+          <w:b/>
+          <w:bCs/>
+        </w:rPr>
+      </w:pPr>
+      <w:r>
+        <w:rPr>
+          <w:b/>
+          <w:bCs/>
+        </w:rPr>
+        <w:t>Total registered students</w:t>
+      </w:r>
+    </w:p>
+    <w:p>
+      <w:pPr>
+        <w:numPr>
+          <w:ilvl w:val="0"/>
+          <w:numId w:val="21"/>
+        </w:numPr>
+        <w:spacing w:after="0"/>
+        <w:rPr>
+          <w:b/>
+          <w:bCs/>
+        </w:rPr>
+      </w:pPr>
+      <w:r>
+        <w:rPr>
+          <w:b/>
+          <w:bCs/>
+        </w:rPr>
+        <w:t>Total health visits</w:t>
+      </w:r>
+    </w:p>
+    <w:p>
+      <w:pPr>
+        <w:numPr>
+          <w:ilvl w:val="0"/>
+          <w:numId w:val="21"/>
+        </w:numPr>
+        <w:spacing w:after="0"/>
+        <w:rPr>
+          <w:b/>
+          <w:bCs/>
+        </w:rPr>
+      </w:pPr>
+      <w:r>
+        <w:rPr>
+          <w:b/>
+          <w:bCs/>
+        </w:rPr>
+        <w:t>Today’s patients</w:t>
+      </w:r>
+    </w:p>
+    <w:p>
+      <w:pPr>
+        <w:numPr>
+          <w:ilvl w:val="0"/>
+          <w:numId w:val="22"/>
+        </w:numPr>
+        <w:spacing w:after="0"/>
+        <w:rPr>
+          <w:b/>
+          <w:bCs/>
+        </w:rPr>
+      </w:pPr>
+      <w:r>
+        <w:rPr>
+          <w:b/>
+          <w:bCs/>
+        </w:rPr>
+        <w:t>Frequent visitors</w:t>
+      </w:r>
+    </w:p>
+    <w:p>
+      <w:pPr>
+        <w:numPr>
+          <w:ilvl w:val="0"/>
+          <w:numId w:val="22"/>
+        </w:numPr>
+        <w:spacing w:after="0"/>
+        <w:rPr>
+          <w:b/>
+          <w:bCs/>
+        </w:rPr>
+      </w:pPr>
+      <w:r>
+        <w:rPr>
+          <w:b/>
+          <w:bCs/>
+        </w:rPr>
+        <w:t>Common complaints</w:t>
+      </w:r>
+    </w:p>
+    <w:p>
+      <w:pPr>
+        <w:numPr>
+          <w:ilvl w:val="0"/>
+          <w:numId w:val="22"/>
+        </w:numPr>
+        <w:spacing w:after="0"/>
+        <w:rPr>
+          <w:b/>
+          <w:bCs/>
+        </w:rPr>
+      </w:pPr>
+      <w:r>
+        <w:rPr>
+          <w:b/>
+          <w:bCs/>
+        </w:rPr>
+        <w:t>Recent health records</w:t>
+      </w:r>
+    </w:p>
+    <w:p>
+      <w:pPr>
+        <w:spacing w:after="0"/>
+        <w:ind w:left="720"/>
+        <w:rPr>
+          <w:b/>
+          <w:bCs/>
+        </w:rPr>
+      </w:pPr>
+      <w:r>
+        <w:rPr>
+          <w:b/>
+          <w:bCs/>
+        </w:rPr>
+        <w:t>So overall, the current app supports:</w:t>
+      </w:r>
+    </w:p>
+    <w:p>
+      <w:pPr>
+        <w:numPr>
+          <w:ilvl w:val="0"/>
+          <w:numId w:val="23"/>
+        </w:numPr>
+        <w:spacing w:after="0"/>
+        <w:rPr>
+          <w:b/>
+          <w:bCs/>
+        </w:rPr>
+      </w:pPr>
+      <w:r>
+        <w:rPr>
+          <w:b/>
+          <w:bCs/>
+        </w:rPr>
+        <w:t>Account creation</w:t>
+      </w:r>
+    </w:p>
+    <w:p>
+      <w:pPr>
+        <w:numPr>
+          <w:ilvl w:val="0"/>
+          <w:numId w:val="23"/>
+        </w:numPr>
+        <w:spacing w:after="0"/>
+        <w:rPr>
+          <w:b/>
+          <w:bCs/>
+        </w:rPr>
+      </w:pPr>
+      <w:r>
+        <w:rPr>
+          <w:b/>
+          <w:bCs/>
+        </w:rPr>
+        <w:t>Login for doctor and student</w:t>
+      </w:r>
+    </w:p>
+    <w:p>
+      <w:pPr>
+        <w:numPr>
+          <w:ilvl w:val="0"/>
+          <w:numId w:val="23"/>
+        </w:numPr>
+        <w:spacing w:after="0"/>
+        <w:rPr>
+          <w:b/>
+          <w:bCs/>
+        </w:rPr>
+      </w:pPr>
+      <w:r>
+        <w:rPr>
+          <w:b/>
+          <w:bCs/>
+        </w:rPr>
+        <w:t>Student roll number-based access</w:t>
+      </w:r>
+    </w:p>
+    <w:p>
+      <w:pPr>
+        <w:numPr>
+          <w:ilvl w:val="0"/>
+          <w:numId w:val="23"/>
+        </w:numPr>
+        <w:spacing w:after="0"/>
+        <w:rPr>
+          <w:b/>
+          <w:bCs/>
+        </w:rPr>
+      </w:pPr>
+      <w:r>
+        <w:rPr>
+          <w:b/>
+          <w:bCs/>
+        </w:rPr>
+        <w:t>Student registration</w:t>
+      </w:r>
+    </w:p>
+    <w:p>
+      <w:pPr>
+        <w:numPr>
+          <w:ilvl w:val="0"/>
+          <w:numId w:val="23"/>
+        </w:numPr>
+        <w:spacing w:after="0"/>
+        <w:rPr>
+          <w:b/>
+          <w:bCs/>
+        </w:rPr>
+      </w:pPr>
+      <w:r>
+        <w:rPr>
+          <w:b/>
+          <w:bCs/>
+        </w:rPr>
+        <w:t>Health record entry</w:t>
+      </w:r>
+    </w:p>
+    <w:p>
+      <w:pPr>
+        <w:numPr>
+          <w:ilvl w:val="0"/>
+          <w:numId w:val="23"/>
+        </w:numPr>
+        <w:spacing w:after="0"/>
+        <w:rPr>
+          <w:b/>
+          <w:bCs/>
+        </w:rPr>
+      </w:pPr>
+      <w:r>
+        <w:rPr>
+          <w:b/>
+          <w:bCs/>
+        </w:rPr>
+        <w:t>Health record viewing</w:t>
+      </w:r>
+    </w:p>
+    <w:p>
+      <w:pPr>
+        <w:numPr>
+          <w:ilvl w:val="0"/>
+          <w:numId w:val="23"/>
+        </w:numPr>
+        <w:spacing w:after="0"/>
+        <w:rPr>
+          <w:b/>
+          <w:bCs/>
+        </w:rPr>
+      </w:pPr>
+      <w:r>
+        <w:rPr>
+          <w:b/>
+          <w:bCs/>
+        </w:rPr>
+        <w:t>Dashboard summary</w:t>
+      </w:r>
+    </w:p>
+    <w:p>
+      <w:pPr>
+        <w:spacing w:after="0"/>
+        <w:ind w:left="720"/>
+        <w:rPr>
+          <w:b/>
+          <w:bCs/>
+        </w:rPr>
+      </w:pPr>
+    </w:p>
+    <w:p>
+      <w:pPr>
+        <w:spacing w:after="0"/>
+        <w:ind w:left="-567"/>
+      </w:pPr>
+      <w:r>
+        <w:t xml:space="preserve">The Campus Dispensary Management System is a </w:t>
+      </w:r>
+      <w:r>
+        <w:rPr>
+          <w:b/>
+          <w:bCs/>
+        </w:rPr>
+        <w:t>web application</w:t>
+      </w:r>
+      <w:r>
+        <w:t xml:space="preserve"> I developed </w:t>
+      </w:r>
+      <w:r>
+        <w:rPr>
+          <w:b/>
+          <w:bCs/>
+        </w:rPr>
+        <w:t>to digitize the management of student health records</w:t>
+      </w:r>
+      <w:r>
+        <w:t xml:space="preserve"> in a college dispensary.</w:t>
+      </w:r>
+    </w:p>
+    <w:p>
+      <w:pPr>
+        <w:spacing w:after="0"/>
+        <w:ind w:left="-567"/>
+      </w:pPr>
+      <w:r>
+        <w:t>The basic idea was to have a centralized system where student information and their medical visits can be stored and accessed easily.</w:t>
+      </w:r>
+    </w:p>
+    <w:p>
+      <w:pPr>
+        <w:spacing w:after="0"/>
+        <w:ind w:left="-567"/>
+      </w:pPr>
+      <w:r>
+        <w:t xml:space="preserve">There are two main users in the system </w:t>
+      </w:r>
+      <w:r>
+        <w:t>-</w:t>
+      </w:r>
+      <w:r>
+        <w:t xml:space="preserve"> students and doctors. A student can log in and view their own health history</w:t>
+      </w:r>
+      <w:r>
+        <w:t xml:space="preserve"> and prescription if going through any medication</w:t>
+      </w:r>
+      <w:r>
+        <w:t>, while a doctor has access to the management features such as adding student information, adding health records and viewing patient history.</w:t>
+      </w:r>
+    </w:p>
+    <w:p>
+      <w:pPr>
+        <w:spacing w:after="0"/>
+        <w:ind w:left="-567"/>
+      </w:pPr>
+      <w:r>
+        <w:t>I also added a doctor dashboard that provides basic statistics such as the number of registered students, health visits, patients visiting today, frequent visitors and common complaints.</w:t>
+      </w:r>
+    </w:p>
+    <w:p>
+      <w:pPr>
+        <w:spacing w:after="0"/>
+        <w:ind w:left="-567"/>
+      </w:pPr>
+      <w:r>
+        <w:lastRenderedPageBreak/>
+        <w:t>From the technical side, I used HTML, CSS and JavaScript for the frontend, Node.js with Express.js for the backend and MySQL for the database. The frontend communicates with the backend through HTTP APIs using fetch and the backend performs validation and database operations.</w:t>
+      </w:r>
+    </w:p>
+    <w:p>
+      <w:pPr>
+        <w:spacing w:after="0"/>
+        <w:ind w:left="-567"/>
+      </w:pPr>
+      <w:r>
+        <w:t>One of the important things I focused on was keeping the student and health information separate in the database and connecting them through the student's roll number. I also used parameterized SQL queries and server-side validation.</w:t>
+      </w:r>
+    </w:p>
+    <w:p>
+      <w:pPr>
+        <w:spacing w:after="0"/>
+        <w:ind w:left="-567"/>
+      </w:pPr>
+      <w:r>
+        <w:t>The current project is an academic working prototype, so if it were deployed as a real medical system, I would further strengthen authentication, authorization, password security and data privacy</w:t>
+      </w:r>
+    </w:p>
+    <w:p>
+      <w:pPr>
+        <w:spacing w:after="0"/>
+        <w:ind w:left="-567"/>
+        <w:rPr>
+          <w:b/>
+          <w:bCs/>
+        </w:rPr>
+      </w:pPr>
+    </w:p>
+    <w:p>
+      <w:pPr>
+        <w:spacing w:after="0"/>
+        <w:ind w:left="-567"/>
+      </w:pPr>
+      <w:r>
+        <w:rPr>
+          <w:b/>
+          <w:bCs/>
+        </w:rPr>
+        <w:t>WHY</w:t>
+      </w:r>
+      <w:r>
+        <w:rPr>
+          <w:b/>
+          <w:bCs/>
+        </w:rPr>
+        <w:t xml:space="preserve">- </w:t>
+      </w:r>
+      <w:r>
+        <w:t>I wanted to build something that was more than just a basic CRUD application. It gave me an opportunity to work with frontend development, backend APIs, database design, user roles and data analysis in one project.</w:t>
+      </w:r>
+    </w:p>
+    <w:p>
+      <w:pPr>
+        <w:spacing w:after="0"/>
+        <w:ind w:left="-567"/>
+        <w:rPr>
+          <w:b/>
+          <w:bCs/>
+        </w:rPr>
+      </w:pPr>
+    </w:p>
+    <w:p>
+      <w:pPr>
+        <w:spacing w:after="0"/>
+        <w:ind w:left="-567"/>
+      </w:pPr>
+      <w:r>
+        <w:rPr>
+          <w:b/>
+          <w:bCs/>
+        </w:rPr>
+        <w:t>Problem-</w:t>
+      </w:r>
+      <w:r>
+        <w:t xml:space="preserve"> manual records for student’s information, prescription taken away at pharmacy. So, to encounter all these problems in 1 application made.</w:t>
+      </w:r>
+    </w:p>
+    <w:p>
+      <w:pPr>
+        <w:spacing w:after="0"/>
+        <w:ind w:left="-567"/>
+      </w:pPr>
+    </w:p>
+    <w:p>
+      <w:pPr>
+        <w:spacing w:after="0"/>
+        <w:ind w:left="-567"/>
+      </w:pPr>
+      <w:r>
+        <w:t>Web application that digitizes the management of the dispensary system. Includes majorly the student’s health history. Campus use it for management purposes and students to view or refer to when under medication.</w:t>
+      </w:r>
+    </w:p>
+    <w:p>
+      <w:pPr>
+        <w:spacing w:after="0"/>
+        <w:ind w:left="-567"/>
+      </w:pPr>
+      <w:r>
+        <w:t xml:space="preserve">2 roles – student and doctor. Student just views their history when logged in. doctor gets 3 options and a dashboard representing the data analysis of visits so far. </w:t>
+      </w:r>
+    </w:p>
+    <w:p>
+      <w:pPr>
+        <w:spacing w:after="0"/>
+        <w:ind w:left="-567"/>
+      </w:pPr>
+      <w:r>
+        <w:t xml:space="preserve">Use authentication and authorization terminologies here, referring role-based access. </w:t>
+      </w:r>
+    </w:p>
+    <w:p>
+      <w:pPr>
+        <w:spacing w:after="0"/>
+        <w:ind w:left="-567"/>
+      </w:pPr>
+      <w:r>
+        <w:rPr>
+          <w:b/>
+          <w:bCs/>
+        </w:rPr>
+        <w:t>Authentication</w:t>
+      </w:r>
+      <w:r>
+        <w:t xml:space="preserve"> verifies the identity of the user, whereas </w:t>
+      </w:r>
+      <w:r>
+        <w:rPr>
+          <w:b/>
+          <w:bCs/>
+        </w:rPr>
+        <w:t>authorization</w:t>
+      </w:r>
+      <w:r>
+        <w:t xml:space="preserve"> determines what that authenticated user is allowed to access.</w:t>
+      </w:r>
+    </w:p>
+    <w:p>
+      <w:pPr>
+        <w:spacing w:after="0"/>
+        <w:ind w:left="-567"/>
+      </w:pPr>
+    </w:p>
+    <w:p>
+      <w:pPr>
+        <w:spacing w:after="0"/>
+        <w:ind w:left="-567"/>
+        <w:rPr>
+          <w:sz w:val="28"/>
+          <w:szCs w:val="28"/>
+        </w:rPr>
+      </w:pPr>
+      <w:r>
+        <w:rPr>
+          <w:sz w:val="28"/>
+          <w:szCs w:val="28"/>
+        </w:rPr>
+        <w:t>CLIENT SERVER arch. Basic flow</w:t>
+      </w:r>
+    </w:p>
+    <w:p>
+      <w:pPr>
+        <w:spacing w:after="0"/>
+        <w:ind w:left="-567"/>
+        <w:rPr>
+          <w:b/>
+          <w:bCs/>
+        </w:rPr>
+      </w:pPr>
+      <w:r>
+        <w:rPr>
+          <w:b/>
+          <w:bCs/>
+        </w:rPr>
+        <w:t>The frontend is responsible for the user interface and collecting user input. When an operation is performed, JavaScript sends an HTTP request to the Express backend using fetch. The backend validates the request, performs the required database operation</w:t>
+      </w:r>
+      <w:r>
+        <w:rPr>
+          <w:b/>
+          <w:bCs/>
+        </w:rPr>
+        <w:t xml:space="preserve"> (parametrized SQL)</w:t>
+      </w:r>
+      <w:r>
+        <w:rPr>
+          <w:b/>
+          <w:bCs/>
+        </w:rPr>
+        <w:t xml:space="preserve"> in MySQL, and sends a JSON response back to the frontend</w:t>
+      </w:r>
+    </w:p>
+    <w:p>
+      <w:pPr>
+        <w:spacing w:after="0"/>
+        <w:ind w:left="-567"/>
+      </w:pPr>
+      <w:r>
+        <w:t xml:space="preserve">Why HTTP </w:t>
+      </w:r>
+      <w:proofErr w:type="spellStart"/>
+      <w:r>
+        <w:t>req</w:t>
+      </w:r>
+      <w:proofErr w:type="spellEnd"/>
+      <w:r>
+        <w:t>? what is fetch?</w:t>
+      </w:r>
+    </w:p>
+    <w:p>
+      <w:pPr>
+        <w:spacing w:after="0"/>
+        <w:ind w:left="-567"/>
+      </w:pPr>
+      <w:r>
+        <w:t>Parameterized SQL?</w:t>
+      </w:r>
+      <w:r>
+        <w:t xml:space="preserve"> Why that needed?</w:t>
+      </w:r>
+    </w:p>
+    <w:p>
+      <w:pPr>
+        <w:spacing w:after="0"/>
+        <w:ind w:left="-567"/>
+      </w:pPr>
+    </w:p>
+    <w:p>
+      <w:pPr>
+        <w:spacing w:after="0"/>
+        <w:ind w:left="-567"/>
+        <w:rPr>
+          <w:sz w:val="28"/>
+          <w:szCs w:val="28"/>
+        </w:rPr>
+      </w:pPr>
+      <w:r>
+        <w:rPr>
+          <w:sz w:val="28"/>
+          <w:szCs w:val="28"/>
+        </w:rPr>
+        <w:t>Why MySQL</w:t>
+      </w:r>
+    </w:p>
+    <w:p>
+      <w:pPr>
+        <w:spacing w:after="0"/>
+        <w:ind w:left="-567"/>
+      </w:pPr>
+      <w:r>
+        <w:t>The application contains structured and related data such as users, students, doctors and health visits. MySQL is suitable because it supports relational tables, relationships, joins, constraints and transactions, which fit this type of application</w:t>
+      </w:r>
+    </w:p>
+    <w:p>
+      <w:pPr>
+        <w:spacing w:after="0"/>
+        <w:ind w:left="-567"/>
+      </w:pPr>
+    </w:p>
+    <w:p>
+      <w:pPr>
+        <w:spacing w:after="0"/>
+        <w:ind w:left="-567"/>
+        <w:rPr>
+          <w:sz w:val="28"/>
+          <w:szCs w:val="28"/>
+        </w:rPr>
+      </w:pPr>
+      <w:r>
+        <w:rPr>
+          <w:sz w:val="28"/>
+          <w:szCs w:val="28"/>
+        </w:rPr>
+        <w:t>Tables</w:t>
+      </w:r>
+    </w:p>
+    <w:p>
+      <w:pPr>
+        <w:spacing w:after="0"/>
+        <w:ind w:left="-567"/>
+      </w:pPr>
+      <w:r>
+        <w:t>Users, health, student, doctor</w:t>
+      </w:r>
+    </w:p>
+    <w:p>
+      <w:pPr>
+        <w:spacing w:after="0"/>
+        <w:ind w:left="-567"/>
+      </w:pPr>
+    </w:p>
+    <w:p>
+      <w:pPr>
+        <w:spacing w:after="0"/>
+        <w:ind w:left="-567"/>
+        <w:rPr>
+          <w:b/>
+          <w:bCs/>
+          <w:sz w:val="28"/>
+          <w:szCs w:val="28"/>
+        </w:rPr>
+      </w:pPr>
+      <w:r>
+        <w:rPr>
+          <w:b/>
+          <w:bCs/>
+          <w:sz w:val="28"/>
+          <w:szCs w:val="28"/>
+        </w:rPr>
+        <w:t>Node.js</w:t>
+      </w:r>
+    </w:p>
+    <w:p>
+      <w:pPr>
+        <w:spacing w:after="0"/>
+        <w:ind w:left="-567"/>
+      </w:pPr>
+      <w:r>
+        <w:t>Node.js allows us to use JavaScript on the server side and handles I/O operations efficiently using its event-driven architecture.</w:t>
+      </w:r>
+    </w:p>
+    <w:p>
+      <w:pPr>
+        <w:spacing w:after="0"/>
+        <w:ind w:left="-567"/>
+      </w:pPr>
+    </w:p>
+    <w:p>
+      <w:pPr>
+        <w:spacing w:after="0"/>
+        <w:ind w:left="-567"/>
+      </w:pPr>
+    </w:p>
+    <w:p>
+      <w:pPr>
+        <w:spacing w:after="0"/>
+        <w:ind w:left="-567"/>
+        <w:rPr>
+          <w:b/>
+          <w:bCs/>
+          <w:sz w:val="28"/>
+          <w:szCs w:val="28"/>
+        </w:rPr>
+      </w:pPr>
+      <w:r>
+        <w:rPr>
+          <w:b/>
+          <w:bCs/>
+          <w:sz w:val="28"/>
+          <w:szCs w:val="28"/>
+        </w:rPr>
+        <w:lastRenderedPageBreak/>
+        <w:t>Express</w:t>
+      </w:r>
+    </w:p>
+    <w:p>
+      <w:pPr>
+        <w:spacing w:after="0"/>
+        <w:ind w:left="-567"/>
+      </w:pPr>
+      <w:r>
+        <w:t>Express is a lightweight framework on top of Node.js that makes it easier to create API routes, use middleware and handle HTTP requests and responses.</w:t>
+      </w:r>
+    </w:p>
+    <w:p>
+      <w:pPr>
+        <w:spacing w:after="0"/>
+        <w:ind w:left="-567"/>
+      </w:pPr>
+    </w:p>
+    <w:p>
+      <w:pPr>
+        <w:spacing w:after="0"/>
+        <w:ind w:left="-567"/>
+      </w:pPr>
+      <w:r>
+        <w:t>Rest APIs? Why HTTP API not just API?</w:t>
+      </w:r>
+    </w:p>
+    <w:p>
+      <w:pPr>
+        <w:spacing w:after="0"/>
+        <w:ind w:left="-567"/>
+      </w:pPr>
+    </w:p>
+    <w:p>
+      <w:pPr>
+        <w:spacing w:after="0"/>
+        <w:ind w:left="-567"/>
+        <w:rPr>
+          <w:sz w:val="28"/>
+          <w:szCs w:val="28"/>
+        </w:rPr>
+      </w:pPr>
+      <w:r>
+        <w:rPr>
+          <w:sz w:val="28"/>
+          <w:szCs w:val="28"/>
+        </w:rPr>
+        <w:t>JSON</w:t>
+      </w:r>
+    </w:p>
+    <w:p>
+      <w:pPr>
+        <w:spacing w:after="0"/>
+        <w:ind w:left="-567"/>
+      </w:pPr>
+      <w:r>
+        <w:t>JSON was convenient because it provides a standard lightweight format for transferring structured data between the frontend and backend. For prescriptions, it also allows multiple medicine details to be represented as a list.</w:t>
+      </w:r>
+    </w:p>
+    <w:p>
+      <w:pPr>
+        <w:spacing w:after="0"/>
+        <w:ind w:left="-567"/>
+      </w:pPr>
+    </w:p>
+    <w:p>
+      <w:pPr>
+        <w:spacing w:after="0"/>
+        <w:ind w:left="-567"/>
+      </w:pPr>
+      <w:r>
+        <w:t>What is CORS?</w:t>
+      </w:r>
+    </w:p>
+    <w:p>
+      <w:pPr>
+        <w:spacing w:after="0"/>
+        <w:ind w:left="-567"/>
+      </w:pPr>
+    </w:p>
+    <w:p>
+      <w:pPr>
+        <w:spacing w:after="0"/>
+        <w:ind w:left="-567"/>
+      </w:pPr>
+    </w:p>
+    <w:p>
+      <w:pPr>
+        <w:spacing w:after="0"/>
+        <w:ind w:left="-567"/>
+      </w:pPr>
+      <w:r>
+        <w:t>Dominantly LEFT JOIN is used for students to be shown for the health records present</w:t>
+      </w:r>
+    </w:p>
+    <w:p>
+      <w:pPr>
+        <w:spacing w:after="0"/>
+        <w:ind w:left="-567"/>
+      </w:pPr>
+    </w:p>
+    <w:p>
+      <w:pPr>
+        <w:spacing w:after="0"/>
+        <w:ind w:left="-567"/>
+      </w:pPr>
+      <w:r>
+        <w:t xml:space="preserve">Asynchronous programming done so no work waits. Callbacks used to handle </w:t>
+      </w:r>
+    </w:p>
+    <w:p>
+      <w:pPr>
+        <w:spacing w:after="0"/>
+        <w:ind w:left="-567"/>
+      </w:pPr>
+    </w:p>
+    <w:p>
+      <w:pPr>
+        <w:spacing w:after="0"/>
+      </w:pPr>
+    </w:p>
+    <w:p>
+      <w:pPr>
+        <w:spacing w:after="0"/>
+        <w:ind w:left="-567"/>
+      </w:pPr>
+    </w:p>
+    <w:p>
+      <w:pPr>
+        <w:spacing w:after="0"/>
+        <w:ind w:left="-567"/>
+        <w:rPr>
+          <w:sz w:val="28"/>
+          <w:szCs w:val="28"/>
+        </w:rPr>
+      </w:pPr>
+      <w:r>
+        <w:rPr>
+          <w:sz w:val="28"/>
+          <w:szCs w:val="28"/>
+        </w:rPr>
+        <w:t>PROBLEMS</w:t>
+      </w:r>
+    </w:p>
+    <w:p>
+      <w:pPr>
+        <w:spacing w:after="0"/>
+        <w:ind w:left="-567"/>
+      </w:pPr>
+      <w:r>
+        <w:t>D</w:t>
+      </w:r>
+      <w:r>
+        <w:t>uring development, the database structure changed as the application evolved. Instead of assuming that an existing database always had the latest columns, the server could check the schema during startup and make the required compatibility updates.</w:t>
+      </w:r>
+    </w:p>
+    <w:p>
+      <w:pPr>
+        <w:spacing w:after="0"/>
+        <w:ind w:left="-567"/>
+      </w:pPr>
+    </w:p>
+    <w:p>
+      <w:pPr>
+        <w:spacing w:after="0"/>
+        <w:ind w:left="-567"/>
+        <w:rPr>
+          <w:sz w:val="28"/>
+          <w:szCs w:val="28"/>
+        </w:rPr>
+      </w:pPr>
+      <w:r>
+        <w:rPr>
+          <w:sz w:val="28"/>
+          <w:szCs w:val="28"/>
+        </w:rPr>
+        <w:t>IMPROVEMENTS</w:t>
+      </w:r>
+    </w:p>
+    <w:p>
+      <w:pPr>
+        <w:spacing w:after="0"/>
+        <w:ind w:left="-567"/>
+      </w:pPr>
+      <w:r>
+        <w:t xml:space="preserve">Chat bot for students during dispensary off time and urgent cases. </w:t>
+      </w:r>
+    </w:p>
+    <w:p>
+      <w:pPr>
+        <w:spacing w:after="0"/>
+        <w:ind w:left="-567"/>
+      </w:pPr>
+      <w:r>
+        <w:t>Dispensary related info and availability of particular specialist doctor.</w:t>
+      </w:r>
+    </w:p>
+    <w:p>
+      <w:pPr>
+        <w:spacing w:after="0"/>
+        <w:ind w:left="-567"/>
+      </w:pPr>
+      <w:r>
+        <w:t>Alarm if under medication.</w:t>
+      </w:r>
+    </w:p>
+    <w:p>
+      <w:pPr>
+        <w:spacing w:after="0"/>
+        <w:ind w:left="-567"/>
+      </w:pPr>
+      <w:r>
+        <w:t>Call for an ambulance to the hostel.</w:t>
+      </w:r>
+    </w:p>
+    <w:p>
+      <w:pPr>
+        <w:spacing w:after="0"/>
+        <w:ind w:left="-567"/>
+      </w:pPr>
+    </w:p>
+    <w:p>
+      <w:pPr>
+        <w:spacing w:after="0"/>
+        <w:ind w:left="-567"/>
+      </w:pPr>
+      <w:r>
+        <w:t>API – software components communicating.</w:t>
+      </w:r>
+    </w:p>
+    <w:p>
+      <w:pPr>
+        <w:spacing w:after="0"/>
+        <w:ind w:left="-567"/>
+      </w:pPr>
+      <w:r>
+        <w:t>HTTP API – uses HTTP protocol in API communication</w:t>
+      </w:r>
+    </w:p>
+    <w:p>
+      <w:pPr>
+        <w:spacing w:after="0"/>
+        <w:ind w:left="-567"/>
+      </w:pPr>
+      <w:r>
+        <w:t xml:space="preserve">REST API </w:t>
+      </w:r>
+      <w:r>
+        <w:t>–</w:t>
+      </w:r>
+      <w:r>
+        <w:t xml:space="preserve"> </w:t>
+      </w:r>
+      <w:r>
+        <w:t>API designed according to REST principles, commonly using HTTP methods like GET, POST, PUT and DELETE to interact with resources.</w:t>
+      </w:r>
+    </w:p>
+    <w:p>
+      <w:pPr>
+        <w:spacing w:after="0"/>
+        <w:ind w:left="-567"/>
+      </w:pPr>
+    </w:p>
+    <w:p>
+      <w:pPr>
+        <w:spacing w:after="0"/>
+        <w:ind w:left="-567"/>
+      </w:pPr>
+      <w:r>
+        <w:t>Fetch – function of JS to send HTTP requests to server.</w:t>
+      </w:r>
+    </w:p>
+    <w:p>
+      <w:pPr>
+        <w:spacing w:after="0"/>
+        <w:ind w:left="-567"/>
+      </w:pPr>
+    </w:p>
+    <w:p>
+      <w:pPr>
+        <w:spacing w:after="0"/>
+        <w:ind w:left="-567"/>
+      </w:pPr>
+      <w:r>
+        <w:t>Add Student button clicked</w:t>
+      </w:r>
+      <w:r>
+        <w:t xml:space="preserve"> --&gt; </w:t>
+      </w:r>
+      <w:r>
+        <w:t xml:space="preserve">JavaScript </w:t>
+      </w:r>
+      <w:proofErr w:type="gramStart"/>
+      <w:r>
+        <w:t>fetch(</w:t>
+      </w:r>
+      <w:proofErr w:type="gramEnd"/>
+      <w:r>
+        <w:t>)</w:t>
+      </w:r>
+      <w:r>
+        <w:t xml:space="preserve"> --&gt; </w:t>
+      </w:r>
+      <w:r>
+        <w:t>HTTP POST /</w:t>
+      </w:r>
+      <w:proofErr w:type="spellStart"/>
+      <w:r>
+        <w:t>addstudent</w:t>
+      </w:r>
+      <w:proofErr w:type="spellEnd"/>
+    </w:p>
+    <w:p>
+      <w:pPr>
+        <w:spacing w:after="0"/>
+        <w:ind w:left="-567"/>
+      </w:pPr>
+      <w:r>
+        <w:t xml:space="preserve">        ↓</w:t>
+      </w:r>
+    </w:p>
+    <w:p>
+      <w:pPr>
+        <w:spacing w:after="0"/>
+        <w:ind w:left="-567"/>
+      </w:pPr>
+      <w:r>
+        <w:t>Node.js + Express route</w:t>
+      </w:r>
+      <w:r>
+        <w:t xml:space="preserve"> --&gt; </w:t>
+      </w:r>
+      <w:r>
+        <w:t>SQL INSERT query</w:t>
+      </w:r>
+      <w:r>
+        <w:t xml:space="preserve"> --&gt; </w:t>
+      </w:r>
+      <w:r>
+        <w:t>MySQL stores student data</w:t>
+      </w:r>
+    </w:p>
+    <w:p>
+      <w:pPr>
+        <w:spacing w:after="0"/>
+        <w:ind w:left="-567"/>
+      </w:pPr>
+      <w:r>
+        <w:t xml:space="preserve">        ↓</w:t>
+      </w:r>
+    </w:p>
+    <w:p>
+      <w:pPr>
+        <w:spacing w:after="0"/>
+        <w:ind w:left="-567"/>
+      </w:pPr>
+      <w:r>
+        <w:t>MySQL returns query result to backend</w:t>
+      </w:r>
+      <w:r>
+        <w:t xml:space="preserve"> --&gt; </w:t>
+      </w:r>
+      <w:r>
+        <w:t>Backend sends JSON response</w:t>
+      </w:r>
+      <w:r>
+        <w:t xml:space="preserve"> --&gt; </w:t>
+      </w:r>
+      <w:r>
+        <w:t>Frontend receives response</w:t>
+      </w:r>
+    </w:p>
+    <w:p>
+      <w:pPr>
+        <w:spacing w:after="0"/>
+        <w:ind w:left="-567"/>
+      </w:pPr>
+    </w:p>
+    <w:p>
+      <w:pPr>
+        <w:spacing w:after="0"/>
+        <w:ind w:left="-567"/>
+      </w:pPr>
+      <w:r>
+        <w:rPr>
+          <w:b/>
+          <w:bCs/>
+          <w:sz w:val="28"/>
+          <w:szCs w:val="28"/>
+        </w:rPr>
+        <w:t>Parametrized SQL</w:t>
+      </w:r>
+      <w:r>
+        <w:rPr>
+          <w:sz w:val="28"/>
+          <w:szCs w:val="28"/>
+        </w:rPr>
+        <w:t xml:space="preserve"> </w:t>
+      </w:r>
+      <w:r>
+        <w:t xml:space="preserve">-&gt; </w:t>
+      </w:r>
+      <w:r>
+        <w:t xml:space="preserve">INSERT INTO students VALUES </w:t>
+      </w:r>
+      <w:proofErr w:type="gramStart"/>
+      <w:r>
+        <w:t>(?,</w:t>
+      </w:r>
+      <w:proofErr w:type="gramEnd"/>
+      <w:r>
+        <w:t xml:space="preserve"> ?, ?);</w:t>
+      </w:r>
+    </w:p>
+    <w:p>
+      <w:pPr>
+        <w:spacing w:after="0"/>
+        <w:ind w:left="-567"/>
+      </w:pPr>
+      <w:r>
+        <w:t>Ensure user input passed separately</w:t>
+      </w:r>
+      <w:r>
+        <w:t>, preventing SQL injection.</w:t>
+      </w:r>
+    </w:p>
+    <w:p>
+      <w:pPr>
+        <w:spacing w:after="0"/>
+        <w:ind w:left="-567"/>
+      </w:pPr>
+    </w:p>
+    <w:p>
+      <w:pPr>
+        <w:spacing w:after="0"/>
+        <w:ind w:left="-567"/>
+      </w:pPr>
+      <w:r>
+        <w:rPr>
+          <w:sz w:val="28"/>
+          <w:szCs w:val="28"/>
+        </w:rPr>
+        <w:t>ENDPOINT</w:t>
+      </w:r>
+      <w:r>
+        <w:rPr>
+          <w:sz w:val="28"/>
+          <w:szCs w:val="28"/>
+        </w:rPr>
+        <w:t xml:space="preserve"> </w:t>
+      </w:r>
+      <w:r>
+        <w:t xml:space="preserve">An endpoint is </w:t>
+      </w:r>
+      <w:r>
+        <w:rPr>
+          <w:b/>
+          <w:bCs/>
+        </w:rPr>
+        <w:t>a specific URL/path through which a client can access a particular API operation/resource.</w:t>
+      </w:r>
+      <w:r>
+        <w:t xml:space="preserve"> Example: /</w:t>
+      </w:r>
+      <w:proofErr w:type="spellStart"/>
+      <w:r>
+        <w:t>addstudent</w:t>
+      </w:r>
+      <w:proofErr w:type="spellEnd"/>
+      <w:r>
+        <w:t>. SPECIFIC ENTRY POINT OF AN API.</w:t>
+      </w:r>
+    </w:p>
+    <w:p>
+      <w:pPr>
+        <w:spacing w:after="0"/>
+        <w:ind w:left="-567"/>
+        <w:rPr>
+          <w:sz w:val="18"/>
+          <w:szCs w:val="18"/>
+        </w:rPr>
+      </w:pPr>
+    </w:p>
+    <w:p>
+      <w:pPr>
+        <w:spacing w:after="0"/>
+        <w:ind w:left="-567"/>
+      </w:pPr>
+      <w:r>
+        <w:rPr>
+          <w:sz w:val="28"/>
+          <w:szCs w:val="28"/>
+        </w:rPr>
+        <w:t xml:space="preserve">JSON </w:t>
+      </w:r>
+      <w:r>
+        <w:t>is a lightweight data-interchange format commonly used to represent and exchange structured data between frontend and backend.</w:t>
       </w:r>
     </w:p>
     <w:sectPr>
@@ -513,6 +2639,155 @@
 <file path=word/numbering.xml><?xml version="1.0" encoding="utf-8"?>
 <w:numbering xmlns:wpc="http://schemas.microsoft.com/office/word/2010/wordprocessingCanvas" xmlns:cx="http://schemas.microsoft.com/office/drawing/2014/chartex" xmlns:cx1="http://schemas.microsoft.com/office/drawing/2015/9/8/chartex" xmlns:cx2="http://schemas.microsoft.com/office/drawing/2015/10/21/chartex" xmlns:cx3="http://schemas.microsoft.com/office/drawing/2016/5/9/chartex" xmlns:cx4="http://schemas.microsoft.com/office/drawing/2016/5/10/chartex" xmlns:cx5="http://schemas.microsoft.com/office/drawing/2016/5/11/chartex" xmlns:cx6="http://schemas.microsoft.com/office/drawing/2016/5/12/chartex" xmlns:cx7="http://schemas.microsoft.com/office/drawing/2016/5/13/chartex" xmlns:cx8="http://schemas.microsoft.com/office/drawing/2016/5/14/chartex" xmlns:mc="http://schemas.openxmlformats.org/markup-compatibility/2006" xmlns:aink="http://schemas.microsoft.com/office/drawing/2016/ink" xmlns:am3d="http://schemas.microsoft.com/office/drawing/2017/model3d" xmlns:o="urn:schemas-microsoft-com:office:office" xmlns:oel="http://schemas.microsoft.com/office/2019/extlst" xmlns:r="http://schemas.openxmlformats.org/officeDocument/2006/relationships" xmlns:m="http://schemas.openxmlformats.org/officeDocument/2006/math" xmlns:v="urn:schemas-microsoft-com:vml" xmlns:wp14="http://schemas.microsoft.com/office/word/2010/wordprocessingDrawing" xmlns:wp="http://schemas.openxmlformats.org/drawingml/2006/wordprocessingDrawing" xmlns:w10="urn:schemas-microsoft-com:office:word" xmlns:w="http://schemas.openxmlformats.org/wordprocessingml/2006/main" xmlns:w14="http://schemas.microsoft.com/office/word/2010/wordml" xmlns:w15="http://schemas.microsoft.com/office/word/2012/wordml" xmlns:w16cex="http://schemas.microsoft.com/office/word/2018/wordml/cex" xmlns:w16cid="http://schemas.microsoft.com/office/word/2016/wordml/cid" xmlns:w16="http://schemas.microsoft.com/office/word/2018/wordml" xmlns:w16du="http://schemas.microsoft.com/office/word/2023/wordml/word16du" xmlns:w16sdtdh="http://schemas.microsoft.com/office/word/2020/wordml/sdtdatahash" xmlns:w16sdtfl="http://schemas.microsoft.com/office/word/2024/wordml/sdtformatlock" xmlns:w16se="http://schemas.microsoft.com/office/word/2015/wordml/symex" xmlns:wpg="http://schemas.microsoft.com/office/word/2010/wordprocessingGroup" xmlns:wpi="http://schemas.microsoft.com/office/word/2010/wordprocessingInk" xmlns:wne="http://schemas.microsoft.com/office/word/2006/wordml" xmlns:wps="http://schemas.microsoft.com/office/word/2010/wordprocessingShape" mc:Ignorable="w14 w15 w16se w16cid w16 w16cex w16sdtdh w16sdtfl w16du wp14">
   <w:abstractNum w:abstractNumId="0" w15:restartNumberingAfterBreak="0">
+    <w:nsid w:val="05B5112F"/>
+    <w:multiLevelType w:val="multilevel"/>
+    <w:tmpl w:val="C094A646"/>
+    <w:lvl w:ilvl="0">
+      <w:start w:val="1"/>
+      <w:numFmt w:val="bullet"/>
+      <w:lvlText w:val=""/>
+      <w:lvlJc w:val="left"/>
+      <w:pPr>
+        <w:tabs>
+          <w:tab w:val="num" w:pos="720"/>
+        </w:tabs>
+        <w:ind w:left="720" w:hanging="360"/>
+      </w:pPr>
+      <w:rPr>
+        <w:rFonts w:ascii="Symbol" w:hAnsi="Symbol" w:hint="default"/>
+        <w:sz w:val="20"/>
+      </w:rPr>
+    </w:lvl>
+    <w:lvl w:ilvl="1" w:tentative="1">
+      <w:start w:val="1"/>
+      <w:numFmt w:val="bullet"/>
+      <w:lvlText w:val="o"/>
+      <w:lvlJc w:val="left"/>
+      <w:pPr>
+        <w:tabs>
+          <w:tab w:val="num" w:pos="1440"/>
+        </w:tabs>
+        <w:ind w:left="1440" w:hanging="360"/>
+      </w:pPr>
+      <w:rPr>
+        <w:rFonts w:ascii="Courier New" w:hAnsi="Courier New" w:hint="default"/>
+        <w:sz w:val="20"/>
+      </w:rPr>
+    </w:lvl>
+    <w:lvl w:ilvl="2" w:tentative="1">
+      <w:start w:val="1"/>
+      <w:numFmt w:val="bullet"/>
+      <w:lvlText w:val=""/>
+      <w:lvlJc w:val="left"/>
+      <w:pPr>
+        <w:tabs>
+          <w:tab w:val="num" w:pos="2160"/>
+        </w:tabs>
+        <w:ind w:left="2160" w:hanging="360"/>
+      </w:pPr>
+      <w:rPr>
+        <w:rFonts w:ascii="Wingdings" w:hAnsi="Wingdings" w:hint="default"/>
+        <w:sz w:val="20"/>
+      </w:rPr>
+    </w:lvl>
+    <w:lvl w:ilvl="3" w:tentative="1">
+      <w:start w:val="1"/>
+      <w:numFmt w:val="bullet"/>
+      <w:lvlText w:val=""/>
+      <w:lvlJc w:val="left"/>
+      <w:pPr>
+        <w:tabs>
+          <w:tab w:val="num" w:pos="2880"/>
+        </w:tabs>
+        <w:ind w:left="2880" w:hanging="360"/>
+      </w:pPr>
+      <w:rPr>
+        <w:rFonts w:ascii="Wingdings" w:hAnsi="Wingdings" w:hint="default"/>
+        <w:sz w:val="20"/>
+      </w:rPr>
+    </w:lvl>
+    <w:lvl w:ilvl="4" w:tentative="1">
+      <w:start w:val="1"/>
+      <w:numFmt w:val="bullet"/>
+      <w:lvlText w:val=""/>
+      <w:lvlJc w:val="left"/>
+      <w:pPr>
+        <w:tabs>
+          <w:tab w:val="num" w:pos="3600"/>
+        </w:tabs>
+        <w:ind w:left="3600" w:hanging="360"/>
+      </w:pPr>
+      <w:rPr>
+        <w:rFonts w:ascii="Wingdings" w:hAnsi="Wingdings" w:hint="default"/>
+        <w:sz w:val="20"/>
+      </w:rPr>
+    </w:lvl>
+    <w:lvl w:ilvl="5" w:tentative="1">
+      <w:start w:val="1"/>
+      <w:numFmt w:val="bullet"/>
+      <w:lvlText w:val=""/>
+      <w:lvlJc w:val="left"/>
+      <w:pPr>
+        <w:tabs>
+          <w:tab w:val="num" w:pos="4320"/>
+        </w:tabs>
+        <w:ind w:left="4320" w:hanging="360"/>
+      </w:pPr>
+      <w:rPr>
+        <w:rFonts w:ascii="Wingdings" w:hAnsi="Wingdings" w:hint="default"/>
+        <w:sz w:val="20"/>
+      </w:rPr>
+    </w:lvl>
+    <w:lvl w:ilvl="6" w:tentative="1">
+      <w:start w:val="1"/>
+      <w:numFmt w:val="bullet"/>
+      <w:lvlText w:val=""/>
+      <w:lvlJc w:val="left"/>
+      <w:pPr>
+        <w:tabs>
+          <w:tab w:val="num" w:pos="5040"/>
+        </w:tabs>
+        <w:ind w:left="5040" w:hanging="360"/>
+      </w:pPr>
+      <w:rPr>
+        <w:rFonts w:ascii="Wingdings" w:hAnsi="Wingdings" w:hint="default"/>
+        <w:sz w:val="20"/>
+      </w:rPr>
+    </w:lvl>
+    <w:lvl w:ilvl="7" w:tentative="1">
+      <w:start w:val="1"/>
+      <w:numFmt w:val="bullet"/>
+      <w:lvlText w:val=""/>
+      <w:lvlJc w:val="left"/>
+      <w:pPr>
+        <w:tabs>
+          <w:tab w:val="num" w:pos="5760"/>
+        </w:tabs>
+        <w:ind w:left="5760" w:hanging="360"/>
+      </w:pPr>
+      <w:rPr>
+        <w:rFonts w:ascii="Wingdings" w:hAnsi="Wingdings" w:hint="default"/>
+        <w:sz w:val="20"/>
+      </w:rPr>
+    </w:lvl>
+    <w:lvl w:ilvl="8" w:tentative="1">
+      <w:start w:val="1"/>
+      <w:numFmt w:val="bullet"/>
+      <w:lvlText w:val=""/>
+      <w:lvlJc w:val="left"/>
+      <w:pPr>
+        <w:tabs>
+          <w:tab w:val="num" w:pos="6480"/>
+        </w:tabs>
+        <w:ind w:left="6480" w:hanging="360"/>
+      </w:pPr>
+      <w:rPr>
+        <w:rFonts w:ascii="Wingdings" w:hAnsi="Wingdings" w:hint="default"/>
+        <w:sz w:val="20"/>
+      </w:rPr>
+    </w:lvl>
+  </w:abstractNum>
+  <w:abstractNum w:abstractNumId="1" w15:restartNumberingAfterBreak="0">
     <w:nsid w:val="07312634"/>
     <w:multiLevelType w:val="hybridMultilevel"/>
     <w:tmpl w:val="7FDCAA88"/>
@@ -625,7 +2900,680 @@
       </w:rPr>
     </w:lvl>
   </w:abstractNum>
-  <w:abstractNum w:abstractNumId="1" w15:restartNumberingAfterBreak="0">
+  <w:abstractNum w:abstractNumId="2" w15:restartNumberingAfterBreak="0">
+    <w:nsid w:val="10757CEE"/>
+    <w:multiLevelType w:val="multilevel"/>
+    <w:tmpl w:val="32CE8144"/>
+    <w:lvl w:ilvl="0">
+      <w:start w:val="6"/>
+      <w:numFmt w:val="decimal"/>
+      <w:lvlText w:val="%1."/>
+      <w:lvlJc w:val="left"/>
+      <w:pPr>
+        <w:tabs>
+          <w:tab w:val="num" w:pos="720"/>
+        </w:tabs>
+        <w:ind w:left="720" w:hanging="360"/>
+      </w:pPr>
+    </w:lvl>
+    <w:lvl w:ilvl="1" w:tentative="1">
+      <w:start w:val="1"/>
+      <w:numFmt w:val="decimal"/>
+      <w:lvlText w:val="%2."/>
+      <w:lvlJc w:val="left"/>
+      <w:pPr>
+        <w:tabs>
+          <w:tab w:val="num" w:pos="1440"/>
+        </w:tabs>
+        <w:ind w:left="1440" w:hanging="360"/>
+      </w:pPr>
+    </w:lvl>
+    <w:lvl w:ilvl="2" w:tentative="1">
+      <w:start w:val="1"/>
+      <w:numFmt w:val="decimal"/>
+      <w:lvlText w:val="%3."/>
+      <w:lvlJc w:val="left"/>
+      <w:pPr>
+        <w:tabs>
+          <w:tab w:val="num" w:pos="2160"/>
+        </w:tabs>
+        <w:ind w:left="2160" w:hanging="360"/>
+      </w:pPr>
+    </w:lvl>
+    <w:lvl w:ilvl="3" w:tentative="1">
+      <w:start w:val="1"/>
+      <w:numFmt w:val="decimal"/>
+      <w:lvlText w:val="%4."/>
+      <w:lvlJc w:val="left"/>
+      <w:pPr>
+        <w:tabs>
+          <w:tab w:val="num" w:pos="2880"/>
+        </w:tabs>
+        <w:ind w:left="2880" w:hanging="360"/>
+      </w:pPr>
+    </w:lvl>
+    <w:lvl w:ilvl="4" w:tentative="1">
+      <w:start w:val="1"/>
+      <w:numFmt w:val="decimal"/>
+      <w:lvlText w:val="%5."/>
+      <w:lvlJc w:val="left"/>
+      <w:pPr>
+        <w:tabs>
+          <w:tab w:val="num" w:pos="3600"/>
+        </w:tabs>
+        <w:ind w:left="3600" w:hanging="360"/>
+      </w:pPr>
+    </w:lvl>
+    <w:lvl w:ilvl="5" w:tentative="1">
+      <w:start w:val="1"/>
+      <w:numFmt w:val="decimal"/>
+      <w:lvlText w:val="%6."/>
+      <w:lvlJc w:val="left"/>
+      <w:pPr>
+        <w:tabs>
+          <w:tab w:val="num" w:pos="4320"/>
+        </w:tabs>
+        <w:ind w:left="4320" w:hanging="360"/>
+      </w:pPr>
+    </w:lvl>
+    <w:lvl w:ilvl="6" w:tentative="1">
+      <w:start w:val="1"/>
+      <w:numFmt w:val="decimal"/>
+      <w:lvlText w:val="%7."/>
+      <w:lvlJc w:val="left"/>
+      <w:pPr>
+        <w:tabs>
+          <w:tab w:val="num" w:pos="5040"/>
+        </w:tabs>
+        <w:ind w:left="5040" w:hanging="360"/>
+      </w:pPr>
+    </w:lvl>
+    <w:lvl w:ilvl="7" w:tentative="1">
+      <w:start w:val="1"/>
+      <w:numFmt w:val="decimal"/>
+      <w:lvlText w:val="%8."/>
+      <w:lvlJc w:val="left"/>
+      <w:pPr>
+        <w:tabs>
+          <w:tab w:val="num" w:pos="5760"/>
+        </w:tabs>
+        <w:ind w:left="5760" w:hanging="360"/>
+      </w:pPr>
+    </w:lvl>
+    <w:lvl w:ilvl="8" w:tentative="1">
+      <w:start w:val="1"/>
+      <w:numFmt w:val="decimal"/>
+      <w:lvlText w:val="%9."/>
+      <w:lvlJc w:val="left"/>
+      <w:pPr>
+        <w:tabs>
+          <w:tab w:val="num" w:pos="6480"/>
+        </w:tabs>
+        <w:ind w:left="6480" w:hanging="360"/>
+      </w:pPr>
+    </w:lvl>
+  </w:abstractNum>
+  <w:abstractNum w:abstractNumId="3" w15:restartNumberingAfterBreak="0">
+    <w:nsid w:val="19CC544A"/>
+    <w:multiLevelType w:val="multilevel"/>
+    <w:tmpl w:val="A99432C2"/>
+    <w:lvl w:ilvl="0">
+      <w:start w:val="1"/>
+      <w:numFmt w:val="bullet"/>
+      <w:lvlText w:val=""/>
+      <w:lvlJc w:val="left"/>
+      <w:pPr>
+        <w:tabs>
+          <w:tab w:val="num" w:pos="720"/>
+        </w:tabs>
+        <w:ind w:left="720" w:hanging="360"/>
+      </w:pPr>
+      <w:rPr>
+        <w:rFonts w:ascii="Symbol" w:hAnsi="Symbol" w:hint="default"/>
+        <w:sz w:val="20"/>
+      </w:rPr>
+    </w:lvl>
+    <w:lvl w:ilvl="1" w:tentative="1">
+      <w:start w:val="1"/>
+      <w:numFmt w:val="bullet"/>
+      <w:lvlText w:val="o"/>
+      <w:lvlJc w:val="left"/>
+      <w:pPr>
+        <w:tabs>
+          <w:tab w:val="num" w:pos="1440"/>
+        </w:tabs>
+        <w:ind w:left="1440" w:hanging="360"/>
+      </w:pPr>
+      <w:rPr>
+        <w:rFonts w:ascii="Courier New" w:hAnsi="Courier New" w:hint="default"/>
+        <w:sz w:val="20"/>
+      </w:rPr>
+    </w:lvl>
+    <w:lvl w:ilvl="2" w:tentative="1">
+      <w:start w:val="1"/>
+      <w:numFmt w:val="bullet"/>
+      <w:lvlText w:val=""/>
+      <w:lvlJc w:val="left"/>
+      <w:pPr>
+        <w:tabs>
+          <w:tab w:val="num" w:pos="2160"/>
+        </w:tabs>
+        <w:ind w:left="2160" w:hanging="360"/>
+      </w:pPr>
+      <w:rPr>
+        <w:rFonts w:ascii="Wingdings" w:hAnsi="Wingdings" w:hint="default"/>
+        <w:sz w:val="20"/>
+      </w:rPr>
+    </w:lvl>
+    <w:lvl w:ilvl="3" w:tentative="1">
+      <w:start w:val="1"/>
+      <w:numFmt w:val="bullet"/>
+      <w:lvlText w:val=""/>
+      <w:lvlJc w:val="left"/>
+      <w:pPr>
+        <w:tabs>
+          <w:tab w:val="num" w:pos="2880"/>
+        </w:tabs>
+        <w:ind w:left="2880" w:hanging="360"/>
+      </w:pPr>
+      <w:rPr>
+        <w:rFonts w:ascii="Wingdings" w:hAnsi="Wingdings" w:hint="default"/>
+        <w:sz w:val="20"/>
+      </w:rPr>
+    </w:lvl>
+    <w:lvl w:ilvl="4" w:tentative="1">
+      <w:start w:val="1"/>
+      <w:numFmt w:val="bullet"/>
+      <w:lvlText w:val=""/>
+      <w:lvlJc w:val="left"/>
+      <w:pPr>
+        <w:tabs>
+          <w:tab w:val="num" w:pos="3600"/>
+        </w:tabs>
+        <w:ind w:left="3600" w:hanging="360"/>
+      </w:pPr>
+      <w:rPr>
+        <w:rFonts w:ascii="Wingdings" w:hAnsi="Wingdings" w:hint="default"/>
+        <w:sz w:val="20"/>
+      </w:rPr>
+    </w:lvl>
+    <w:lvl w:ilvl="5" w:tentative="1">
+      <w:start w:val="1"/>
+      <w:numFmt w:val="bullet"/>
+      <w:lvlText w:val=""/>
+      <w:lvlJc w:val="left"/>
+      <w:pPr>
+        <w:tabs>
+          <w:tab w:val="num" w:pos="4320"/>
+        </w:tabs>
+        <w:ind w:left="4320" w:hanging="360"/>
+      </w:pPr>
+      <w:rPr>
+        <w:rFonts w:ascii="Wingdings" w:hAnsi="Wingdings" w:hint="default"/>
+        <w:sz w:val="20"/>
+      </w:rPr>
+    </w:lvl>
+    <w:lvl w:ilvl="6" w:tentative="1">
+      <w:start w:val="1"/>
+      <w:numFmt w:val="bullet"/>
+      <w:lvlText w:val=""/>
+      <w:lvlJc w:val="left"/>
+      <w:pPr>
+        <w:tabs>
+          <w:tab w:val="num" w:pos="5040"/>
+        </w:tabs>
+        <w:ind w:left="5040" w:hanging="360"/>
+      </w:pPr>
+      <w:rPr>
+        <w:rFonts w:ascii="Wingdings" w:hAnsi="Wingdings" w:hint="default"/>
+        <w:sz w:val="20"/>
+      </w:rPr>
+    </w:lvl>
+    <w:lvl w:ilvl="7" w:tentative="1">
+      <w:start w:val="1"/>
+      <w:numFmt w:val="bullet"/>
+      <w:lvlText w:val=""/>
+      <w:lvlJc w:val="left"/>
+      <w:pPr>
+        <w:tabs>
+          <w:tab w:val="num" w:pos="5760"/>
+        </w:tabs>
+        <w:ind w:left="5760" w:hanging="360"/>
+      </w:pPr>
+      <w:rPr>
+        <w:rFonts w:ascii="Wingdings" w:hAnsi="Wingdings" w:hint="default"/>
+        <w:sz w:val="20"/>
+      </w:rPr>
+    </w:lvl>
+    <w:lvl w:ilvl="8" w:tentative="1">
+      <w:start w:val="1"/>
+      <w:numFmt w:val="bullet"/>
+      <w:lvlText w:val=""/>
+      <w:lvlJc w:val="left"/>
+      <w:pPr>
+        <w:tabs>
+          <w:tab w:val="num" w:pos="6480"/>
+        </w:tabs>
+        <w:ind w:left="6480" w:hanging="360"/>
+      </w:pPr>
+      <w:rPr>
+        <w:rFonts w:ascii="Wingdings" w:hAnsi="Wingdings" w:hint="default"/>
+        <w:sz w:val="20"/>
+      </w:rPr>
+    </w:lvl>
+  </w:abstractNum>
+  <w:abstractNum w:abstractNumId="4" w15:restartNumberingAfterBreak="0">
+    <w:nsid w:val="1ED8743E"/>
+    <w:multiLevelType w:val="multilevel"/>
+    <w:tmpl w:val="A4B40B18"/>
+    <w:lvl w:ilvl="0">
+      <w:start w:val="1"/>
+      <w:numFmt w:val="decimal"/>
+      <w:lvlText w:val="%1."/>
+      <w:lvlJc w:val="left"/>
+      <w:pPr>
+        <w:tabs>
+          <w:tab w:val="num" w:pos="720"/>
+        </w:tabs>
+        <w:ind w:left="720" w:hanging="360"/>
+      </w:pPr>
+    </w:lvl>
+    <w:lvl w:ilvl="1" w:tentative="1">
+      <w:start w:val="1"/>
+      <w:numFmt w:val="decimal"/>
+      <w:lvlText w:val="%2."/>
+      <w:lvlJc w:val="left"/>
+      <w:pPr>
+        <w:tabs>
+          <w:tab w:val="num" w:pos="1440"/>
+        </w:tabs>
+        <w:ind w:left="1440" w:hanging="360"/>
+      </w:pPr>
+    </w:lvl>
+    <w:lvl w:ilvl="2" w:tentative="1">
+      <w:start w:val="1"/>
+      <w:numFmt w:val="decimal"/>
+      <w:lvlText w:val="%3."/>
+      <w:lvlJc w:val="left"/>
+      <w:pPr>
+        <w:tabs>
+          <w:tab w:val="num" w:pos="2160"/>
+        </w:tabs>
+        <w:ind w:left="2160" w:hanging="360"/>
+      </w:pPr>
+    </w:lvl>
+    <w:lvl w:ilvl="3" w:tentative="1">
+      <w:start w:val="1"/>
+      <w:numFmt w:val="decimal"/>
+      <w:lvlText w:val="%4."/>
+      <w:lvlJc w:val="left"/>
+      <w:pPr>
+        <w:tabs>
+          <w:tab w:val="num" w:pos="2880"/>
+        </w:tabs>
+        <w:ind w:left="2880" w:hanging="360"/>
+      </w:pPr>
+    </w:lvl>
+    <w:lvl w:ilvl="4" w:tentative="1">
+      <w:start w:val="1"/>
+      <w:numFmt w:val="decimal"/>
+      <w:lvlText w:val="%5."/>
+      <w:lvlJc w:val="left"/>
+      <w:pPr>
+        <w:tabs>
+          <w:tab w:val="num" w:pos="3600"/>
+        </w:tabs>
+        <w:ind w:left="3600" w:hanging="360"/>
+      </w:pPr>
+    </w:lvl>
+    <w:lvl w:ilvl="5" w:tentative="1">
+      <w:start w:val="1"/>
+      <w:numFmt w:val="decimal"/>
+      <w:lvlText w:val="%6."/>
+      <w:lvlJc w:val="left"/>
+      <w:pPr>
+        <w:tabs>
+          <w:tab w:val="num" w:pos="4320"/>
+        </w:tabs>
+        <w:ind w:left="4320" w:hanging="360"/>
+      </w:pPr>
+    </w:lvl>
+    <w:lvl w:ilvl="6" w:tentative="1">
+      <w:start w:val="1"/>
+      <w:numFmt w:val="decimal"/>
+      <w:lvlText w:val="%7."/>
+      <w:lvlJc w:val="left"/>
+      <w:pPr>
+        <w:tabs>
+          <w:tab w:val="num" w:pos="5040"/>
+        </w:tabs>
+        <w:ind w:left="5040" w:hanging="360"/>
+      </w:pPr>
+    </w:lvl>
+    <w:lvl w:ilvl="7" w:tentative="1">
+      <w:start w:val="1"/>
+      <w:numFmt w:val="decimal"/>
+      <w:lvlText w:val="%8."/>
+      <w:lvlJc w:val="left"/>
+      <w:pPr>
+        <w:tabs>
+          <w:tab w:val="num" w:pos="5760"/>
+        </w:tabs>
+        <w:ind w:left="5760" w:hanging="360"/>
+      </w:pPr>
+    </w:lvl>
+    <w:lvl w:ilvl="8" w:tentative="1">
+      <w:start w:val="1"/>
+      <w:numFmt w:val="decimal"/>
+      <w:lvlText w:val="%9."/>
+      <w:lvlJc w:val="left"/>
+      <w:pPr>
+        <w:tabs>
+          <w:tab w:val="num" w:pos="6480"/>
+        </w:tabs>
+        <w:ind w:left="6480" w:hanging="360"/>
+      </w:pPr>
+    </w:lvl>
+  </w:abstractNum>
+  <w:abstractNum w:abstractNumId="5" w15:restartNumberingAfterBreak="0">
+    <w:nsid w:val="24B61A52"/>
+    <w:multiLevelType w:val="multilevel"/>
+    <w:tmpl w:val="D79286D4"/>
+    <w:lvl w:ilvl="0">
+      <w:start w:val="1"/>
+      <w:numFmt w:val="bullet"/>
+      <w:lvlText w:val=""/>
+      <w:lvlJc w:val="left"/>
+      <w:pPr>
+        <w:tabs>
+          <w:tab w:val="num" w:pos="720"/>
+        </w:tabs>
+        <w:ind w:left="720" w:hanging="360"/>
+      </w:pPr>
+      <w:rPr>
+        <w:rFonts w:ascii="Symbol" w:hAnsi="Symbol" w:hint="default"/>
+        <w:sz w:val="20"/>
+      </w:rPr>
+    </w:lvl>
+    <w:lvl w:ilvl="1" w:tentative="1">
+      <w:start w:val="1"/>
+      <w:numFmt w:val="bullet"/>
+      <w:lvlText w:val="o"/>
+      <w:lvlJc w:val="left"/>
+      <w:pPr>
+        <w:tabs>
+          <w:tab w:val="num" w:pos="1440"/>
+        </w:tabs>
+        <w:ind w:left="1440" w:hanging="360"/>
+      </w:pPr>
+      <w:rPr>
+        <w:rFonts w:ascii="Courier New" w:hAnsi="Courier New" w:hint="default"/>
+        <w:sz w:val="20"/>
+      </w:rPr>
+    </w:lvl>
+    <w:lvl w:ilvl="2" w:tentative="1">
+      <w:start w:val="1"/>
+      <w:numFmt w:val="bullet"/>
+      <w:lvlText w:val=""/>
+      <w:lvlJc w:val="left"/>
+      <w:pPr>
+        <w:tabs>
+          <w:tab w:val="num" w:pos="2160"/>
+        </w:tabs>
+        <w:ind w:left="2160" w:hanging="360"/>
+      </w:pPr>
+      <w:rPr>
+        <w:rFonts w:ascii="Wingdings" w:hAnsi="Wingdings" w:hint="default"/>
+        <w:sz w:val="20"/>
+      </w:rPr>
+    </w:lvl>
+    <w:lvl w:ilvl="3" w:tentative="1">
+      <w:start w:val="1"/>
+      <w:numFmt w:val="bullet"/>
+      <w:lvlText w:val=""/>
+      <w:lvlJc w:val="left"/>
+      <w:pPr>
+        <w:tabs>
+          <w:tab w:val="num" w:pos="2880"/>
+        </w:tabs>
+        <w:ind w:left="2880" w:hanging="360"/>
+      </w:pPr>
+      <w:rPr>
+        <w:rFonts w:ascii="Wingdings" w:hAnsi="Wingdings" w:hint="default"/>
+        <w:sz w:val="20"/>
+      </w:rPr>
+    </w:lvl>
+    <w:lvl w:ilvl="4" w:tentative="1">
+      <w:start w:val="1"/>
+      <w:numFmt w:val="bullet"/>
+      <w:lvlText w:val=""/>
+      <w:lvlJc w:val="left"/>
+      <w:pPr>
+        <w:tabs>
+          <w:tab w:val="num" w:pos="3600"/>
+        </w:tabs>
+        <w:ind w:left="3600" w:hanging="360"/>
+      </w:pPr>
+      <w:rPr>
+        <w:rFonts w:ascii="Wingdings" w:hAnsi="Wingdings" w:hint="default"/>
+        <w:sz w:val="20"/>
+      </w:rPr>
+    </w:lvl>
+    <w:lvl w:ilvl="5" w:tentative="1">
+      <w:start w:val="1"/>
+      <w:numFmt w:val="bullet"/>
+      <w:lvlText w:val=""/>
+      <w:lvlJc w:val="left"/>
+      <w:pPr>
+        <w:tabs>
+          <w:tab w:val="num" w:pos="4320"/>
+        </w:tabs>
+        <w:ind w:left="4320" w:hanging="360"/>
+      </w:pPr>
+      <w:rPr>
+        <w:rFonts w:ascii="Wingdings" w:hAnsi="Wingdings" w:hint="default"/>
+        <w:sz w:val="20"/>
+      </w:rPr>
+    </w:lvl>
+    <w:lvl w:ilvl="6" w:tentative="1">
+      <w:start w:val="1"/>
+      <w:numFmt w:val="bullet"/>
+      <w:lvlText w:val=""/>
+      <w:lvlJc w:val="left"/>
+      <w:pPr>
+        <w:tabs>
+          <w:tab w:val="num" w:pos="5040"/>
+        </w:tabs>
+        <w:ind w:left="5040" w:hanging="360"/>
+      </w:pPr>
+      <w:rPr>
+        <w:rFonts w:ascii="Wingdings" w:hAnsi="Wingdings" w:hint="default"/>
+        <w:sz w:val="20"/>
+      </w:rPr>
+    </w:lvl>
+    <w:lvl w:ilvl="7" w:tentative="1">
+      <w:start w:val="1"/>
+      <w:numFmt w:val="bullet"/>
+      <w:lvlText w:val=""/>
+      <w:lvlJc w:val="left"/>
+      <w:pPr>
+        <w:tabs>
+          <w:tab w:val="num" w:pos="5760"/>
+        </w:tabs>
+        <w:ind w:left="5760" w:hanging="360"/>
+      </w:pPr>
+      <w:rPr>
+        <w:rFonts w:ascii="Wingdings" w:hAnsi="Wingdings" w:hint="default"/>
+        <w:sz w:val="20"/>
+      </w:rPr>
+    </w:lvl>
+    <w:lvl w:ilvl="8" w:tentative="1">
+      <w:start w:val="1"/>
+      <w:numFmt w:val="bullet"/>
+      <w:lvlText w:val=""/>
+      <w:lvlJc w:val="left"/>
+      <w:pPr>
+        <w:tabs>
+          <w:tab w:val="num" w:pos="6480"/>
+        </w:tabs>
+        <w:ind w:left="6480" w:hanging="360"/>
+      </w:pPr>
+      <w:rPr>
+        <w:rFonts w:ascii="Wingdings" w:hAnsi="Wingdings" w:hint="default"/>
+        <w:sz w:val="20"/>
+      </w:rPr>
+    </w:lvl>
+  </w:abstractNum>
+  <w:abstractNum w:abstractNumId="6" w15:restartNumberingAfterBreak="0">
+    <w:nsid w:val="269A1723"/>
+    <w:multiLevelType w:val="multilevel"/>
+    <w:tmpl w:val="BEE28064"/>
+    <w:lvl w:ilvl="0">
+      <w:start w:val="1"/>
+      <w:numFmt w:val="bullet"/>
+      <w:lvlText w:val=""/>
+      <w:lvlJc w:val="left"/>
+      <w:pPr>
+        <w:tabs>
+          <w:tab w:val="num" w:pos="720"/>
+        </w:tabs>
+        <w:ind w:left="720" w:hanging="360"/>
+      </w:pPr>
+      <w:rPr>
+        <w:rFonts w:ascii="Symbol" w:hAnsi="Symbol" w:hint="default"/>
+        <w:sz w:val="20"/>
+      </w:rPr>
+    </w:lvl>
+    <w:lvl w:ilvl="1" w:tentative="1">
+      <w:start w:val="1"/>
+      <w:numFmt w:val="bullet"/>
+      <w:lvlText w:val="o"/>
+      <w:lvlJc w:val="left"/>
+      <w:pPr>
+        <w:tabs>
+          <w:tab w:val="num" w:pos="1440"/>
+        </w:tabs>
+        <w:ind w:left="1440" w:hanging="360"/>
+      </w:pPr>
+      <w:rPr>
+        <w:rFonts w:ascii="Courier New" w:hAnsi="Courier New" w:hint="default"/>
+        <w:sz w:val="20"/>
+      </w:rPr>
+    </w:lvl>
+    <w:lvl w:ilvl="2" w:tentative="1">
+      <w:start w:val="1"/>
+      <w:numFmt w:val="bullet"/>
+      <w:lvlText w:val=""/>
+      <w:lvlJc w:val="left"/>
+      <w:pPr>
+        <w:tabs>
+          <w:tab w:val="num" w:pos="2160"/>
+        </w:tabs>
+        <w:ind w:left="2160" w:hanging="360"/>
+      </w:pPr>
+      <w:rPr>
+        <w:rFonts w:ascii="Wingdings" w:hAnsi="Wingdings" w:hint="default"/>
+        <w:sz w:val="20"/>
+      </w:rPr>
+    </w:lvl>
+    <w:lvl w:ilvl="3" w:tentative="1">
+      <w:start w:val="1"/>
+      <w:numFmt w:val="bullet"/>
+      <w:lvlText w:val=""/>
+      <w:lvlJc w:val="left"/>
+      <w:pPr>
+        <w:tabs>
+          <w:tab w:val="num" w:pos="2880"/>
+        </w:tabs>
+        <w:ind w:left="2880" w:hanging="360"/>
+      </w:pPr>
+      <w:rPr>
+        <w:rFonts w:ascii="Wingdings" w:hAnsi="Wingdings" w:hint="default"/>
+        <w:sz w:val="20"/>
+      </w:rPr>
+    </w:lvl>
+    <w:lvl w:ilvl="4" w:tentative="1">
+      <w:start w:val="1"/>
+      <w:numFmt w:val="bullet"/>
+      <w:lvlText w:val=""/>
+      <w:lvlJc w:val="left"/>
+      <w:pPr>
+        <w:tabs>
+          <w:tab w:val="num" w:pos="3600"/>
+        </w:tabs>
+        <w:ind w:left="3600" w:hanging="360"/>
+      </w:pPr>
+      <w:rPr>
+        <w:rFonts w:ascii="Wingdings" w:hAnsi="Wingdings" w:hint="default"/>
+        <w:sz w:val="20"/>
+      </w:rPr>
+    </w:lvl>
+    <w:lvl w:ilvl="5" w:tentative="1">
+      <w:start w:val="1"/>
+      <w:numFmt w:val="bullet"/>
+      <w:lvlText w:val=""/>
+      <w:lvlJc w:val="left"/>
+      <w:pPr>
+        <w:tabs>
+          <w:tab w:val="num" w:pos="4320"/>
+        </w:tabs>
+        <w:ind w:left="4320" w:hanging="360"/>
+      </w:pPr>
+      <w:rPr>
+        <w:rFonts w:ascii="Wingdings" w:hAnsi="Wingdings" w:hint="default"/>
+        <w:sz w:val="20"/>
+      </w:rPr>
+    </w:lvl>
+    <w:lvl w:ilvl="6" w:tentative="1">
+      <w:start w:val="1"/>
+      <w:numFmt w:val="bullet"/>
+      <w:lvlText w:val=""/>
+      <w:lvlJc w:val="left"/>
+      <w:pPr>
+        <w:tabs>
+          <w:tab w:val="num" w:pos="5040"/>
+        </w:tabs>
+        <w:ind w:left="5040" w:hanging="360"/>
+      </w:pPr>
+      <w:rPr>
+        <w:rFonts w:ascii="Wingdings" w:hAnsi="Wingdings" w:hint="default"/>
+        <w:sz w:val="20"/>
+      </w:rPr>
+    </w:lvl>
+    <w:lvl w:ilvl="7" w:tentative="1">
+      <w:start w:val="1"/>
+      <w:numFmt w:val="bullet"/>
+      <w:lvlText w:val=""/>
+      <w:lvlJc w:val="left"/>
+      <w:pPr>
+        <w:tabs>
+          <w:tab w:val="num" w:pos="5760"/>
+        </w:tabs>
+        <w:ind w:left="5760" w:hanging="360"/>
+      </w:pPr>
+      <w:rPr>
+        <w:rFonts w:ascii="Wingdings" w:hAnsi="Wingdings" w:hint="default"/>
+        <w:sz w:val="20"/>
+      </w:rPr>
+    </w:lvl>
+    <w:lvl w:ilvl="8" w:tentative="1">
+      <w:start w:val="1"/>
+      <w:numFmt w:val="bullet"/>
+      <w:lvlText w:val=""/>
+      <w:lvlJc w:val="left"/>
+      <w:pPr>
+        <w:tabs>
+          <w:tab w:val="num" w:pos="6480"/>
+        </w:tabs>
+        <w:ind w:left="6480" w:hanging="360"/>
+      </w:pPr>
+      <w:rPr>
+        <w:rFonts w:ascii="Wingdings" w:hAnsi="Wingdings" w:hint="default"/>
+        <w:sz w:val="20"/>
+      </w:rPr>
+    </w:lvl>
+  </w:abstractNum>
+  <w:abstractNum w:abstractNumId="7" w15:restartNumberingAfterBreak="0">
     <w:nsid w:val="31972201"/>
     <w:multiLevelType w:val="hybridMultilevel"/>
     <w:tmpl w:val="F4EEE880"/>
@@ -738,7 +3686,829 @@
       </w:rPr>
     </w:lvl>
   </w:abstractNum>
-  <w:abstractNum w:abstractNumId="2" w15:restartNumberingAfterBreak="0">
+  <w:abstractNum w:abstractNumId="8" w15:restartNumberingAfterBreak="0">
+    <w:nsid w:val="35E37819"/>
+    <w:multiLevelType w:val="multilevel"/>
+    <w:tmpl w:val="62524580"/>
+    <w:lvl w:ilvl="0">
+      <w:start w:val="2"/>
+      <w:numFmt w:val="decimal"/>
+      <w:lvlText w:val="%1."/>
+      <w:lvlJc w:val="left"/>
+      <w:pPr>
+        <w:tabs>
+          <w:tab w:val="num" w:pos="720"/>
+        </w:tabs>
+        <w:ind w:left="720" w:hanging="360"/>
+      </w:pPr>
+    </w:lvl>
+    <w:lvl w:ilvl="1" w:tentative="1">
+      <w:start w:val="1"/>
+      <w:numFmt w:val="decimal"/>
+      <w:lvlText w:val="%2."/>
+      <w:lvlJc w:val="left"/>
+      <w:pPr>
+        <w:tabs>
+          <w:tab w:val="num" w:pos="1440"/>
+        </w:tabs>
+        <w:ind w:left="1440" w:hanging="360"/>
+      </w:pPr>
+    </w:lvl>
+    <w:lvl w:ilvl="2" w:tentative="1">
+      <w:start w:val="1"/>
+      <w:numFmt w:val="decimal"/>
+      <w:lvlText w:val="%3."/>
+      <w:lvlJc w:val="left"/>
+      <w:pPr>
+        <w:tabs>
+          <w:tab w:val="num" w:pos="2160"/>
+        </w:tabs>
+        <w:ind w:left="2160" w:hanging="360"/>
+      </w:pPr>
+    </w:lvl>
+    <w:lvl w:ilvl="3" w:tentative="1">
+      <w:start w:val="1"/>
+      <w:numFmt w:val="decimal"/>
+      <w:lvlText w:val="%4."/>
+      <w:lvlJc w:val="left"/>
+      <w:pPr>
+        <w:tabs>
+          <w:tab w:val="num" w:pos="2880"/>
+        </w:tabs>
+        <w:ind w:left="2880" w:hanging="360"/>
+      </w:pPr>
+    </w:lvl>
+    <w:lvl w:ilvl="4" w:tentative="1">
+      <w:start w:val="1"/>
+      <w:numFmt w:val="decimal"/>
+      <w:lvlText w:val="%5."/>
+      <w:lvlJc w:val="left"/>
+      <w:pPr>
+        <w:tabs>
+          <w:tab w:val="num" w:pos="3600"/>
+        </w:tabs>
+        <w:ind w:left="3600" w:hanging="360"/>
+      </w:pPr>
+    </w:lvl>
+    <w:lvl w:ilvl="5" w:tentative="1">
+      <w:start w:val="1"/>
+      <w:numFmt w:val="decimal"/>
+      <w:lvlText w:val="%6."/>
+      <w:lvlJc w:val="left"/>
+      <w:pPr>
+        <w:tabs>
+          <w:tab w:val="num" w:pos="4320"/>
+        </w:tabs>
+        <w:ind w:left="4320" w:hanging="360"/>
+      </w:pPr>
+    </w:lvl>
+    <w:lvl w:ilvl="6" w:tentative="1">
+      <w:start w:val="1"/>
+      <w:numFmt w:val="decimal"/>
+      <w:lvlText w:val="%7."/>
+      <w:lvlJc w:val="left"/>
+      <w:pPr>
+        <w:tabs>
+          <w:tab w:val="num" w:pos="5040"/>
+        </w:tabs>
+        <w:ind w:left="5040" w:hanging="360"/>
+      </w:pPr>
+    </w:lvl>
+    <w:lvl w:ilvl="7" w:tentative="1">
+      <w:start w:val="1"/>
+      <w:numFmt w:val="decimal"/>
+      <w:lvlText w:val="%8."/>
+      <w:lvlJc w:val="left"/>
+      <w:pPr>
+        <w:tabs>
+          <w:tab w:val="num" w:pos="5760"/>
+        </w:tabs>
+        <w:ind w:left="5760" w:hanging="360"/>
+      </w:pPr>
+    </w:lvl>
+    <w:lvl w:ilvl="8" w:tentative="1">
+      <w:start w:val="1"/>
+      <w:numFmt w:val="decimal"/>
+      <w:lvlText w:val="%9."/>
+      <w:lvlJc w:val="left"/>
+      <w:pPr>
+        <w:tabs>
+          <w:tab w:val="num" w:pos="6480"/>
+        </w:tabs>
+        <w:ind w:left="6480" w:hanging="360"/>
+      </w:pPr>
+    </w:lvl>
+  </w:abstractNum>
+  <w:abstractNum w:abstractNumId="9" w15:restartNumberingAfterBreak="0">
+    <w:nsid w:val="4356699F"/>
+    <w:multiLevelType w:val="multilevel"/>
+    <w:tmpl w:val="99F4C240"/>
+    <w:lvl w:ilvl="0">
+      <w:start w:val="1"/>
+      <w:numFmt w:val="bullet"/>
+      <w:lvlText w:val=""/>
+      <w:lvlJc w:val="left"/>
+      <w:pPr>
+        <w:tabs>
+          <w:tab w:val="num" w:pos="720"/>
+        </w:tabs>
+        <w:ind w:left="720" w:hanging="360"/>
+      </w:pPr>
+      <w:rPr>
+        <w:rFonts w:ascii="Symbol" w:hAnsi="Symbol" w:hint="default"/>
+        <w:sz w:val="20"/>
+      </w:rPr>
+    </w:lvl>
+    <w:lvl w:ilvl="1" w:tentative="1">
+      <w:start w:val="1"/>
+      <w:numFmt w:val="bullet"/>
+      <w:lvlText w:val="o"/>
+      <w:lvlJc w:val="left"/>
+      <w:pPr>
+        <w:tabs>
+          <w:tab w:val="num" w:pos="1440"/>
+        </w:tabs>
+        <w:ind w:left="1440" w:hanging="360"/>
+      </w:pPr>
+      <w:rPr>
+        <w:rFonts w:ascii="Courier New" w:hAnsi="Courier New" w:hint="default"/>
+        <w:sz w:val="20"/>
+      </w:rPr>
+    </w:lvl>
+    <w:lvl w:ilvl="2" w:tentative="1">
+      <w:start w:val="1"/>
+      <w:numFmt w:val="bullet"/>
+      <w:lvlText w:val=""/>
+      <w:lvlJc w:val="left"/>
+      <w:pPr>
+        <w:tabs>
+          <w:tab w:val="num" w:pos="2160"/>
+        </w:tabs>
+        <w:ind w:left="2160" w:hanging="360"/>
+      </w:pPr>
+      <w:rPr>
+        <w:rFonts w:ascii="Wingdings" w:hAnsi="Wingdings" w:hint="default"/>
+        <w:sz w:val="20"/>
+      </w:rPr>
+    </w:lvl>
+    <w:lvl w:ilvl="3" w:tentative="1">
+      <w:start w:val="1"/>
+      <w:numFmt w:val="bullet"/>
+      <w:lvlText w:val=""/>
+      <w:lvlJc w:val="left"/>
+      <w:pPr>
+        <w:tabs>
+          <w:tab w:val="num" w:pos="2880"/>
+        </w:tabs>
+        <w:ind w:left="2880" w:hanging="360"/>
+      </w:pPr>
+      <w:rPr>
+        <w:rFonts w:ascii="Wingdings" w:hAnsi="Wingdings" w:hint="default"/>
+        <w:sz w:val="20"/>
+      </w:rPr>
+    </w:lvl>
+    <w:lvl w:ilvl="4" w:tentative="1">
+      <w:start w:val="1"/>
+      <w:numFmt w:val="bullet"/>
+      <w:lvlText w:val=""/>
+      <w:lvlJc w:val="left"/>
+      <w:pPr>
+        <w:tabs>
+          <w:tab w:val="num" w:pos="3600"/>
+        </w:tabs>
+        <w:ind w:left="3600" w:hanging="360"/>
+      </w:pPr>
+      <w:rPr>
+        <w:rFonts w:ascii="Wingdings" w:hAnsi="Wingdings" w:hint="default"/>
+        <w:sz w:val="20"/>
+      </w:rPr>
+    </w:lvl>
+    <w:lvl w:ilvl="5" w:tentative="1">
+      <w:start w:val="1"/>
+      <w:numFmt w:val="bullet"/>
+      <w:lvlText w:val=""/>
+      <w:lvlJc w:val="left"/>
+      <w:pPr>
+        <w:tabs>
+          <w:tab w:val="num" w:pos="4320"/>
+        </w:tabs>
+        <w:ind w:left="4320" w:hanging="360"/>
+      </w:pPr>
+      <w:rPr>
+        <w:rFonts w:ascii="Wingdings" w:hAnsi="Wingdings" w:hint="default"/>
+        <w:sz w:val="20"/>
+      </w:rPr>
+    </w:lvl>
+    <w:lvl w:ilvl="6" w:tentative="1">
+      <w:start w:val="1"/>
+      <w:numFmt w:val="bullet"/>
+      <w:lvlText w:val=""/>
+      <w:lvlJc w:val="left"/>
+      <w:pPr>
+        <w:tabs>
+          <w:tab w:val="num" w:pos="5040"/>
+        </w:tabs>
+        <w:ind w:left="5040" w:hanging="360"/>
+      </w:pPr>
+      <w:rPr>
+        <w:rFonts w:ascii="Wingdings" w:hAnsi="Wingdings" w:hint="default"/>
+        <w:sz w:val="20"/>
+      </w:rPr>
+    </w:lvl>
+    <w:lvl w:ilvl="7" w:tentative="1">
+      <w:start w:val="1"/>
+      <w:numFmt w:val="bullet"/>
+      <w:lvlText w:val=""/>
+      <w:lvlJc w:val="left"/>
+      <w:pPr>
+        <w:tabs>
+          <w:tab w:val="num" w:pos="5760"/>
+        </w:tabs>
+        <w:ind w:left="5760" w:hanging="360"/>
+      </w:pPr>
+      <w:rPr>
+        <w:rFonts w:ascii="Wingdings" w:hAnsi="Wingdings" w:hint="default"/>
+        <w:sz w:val="20"/>
+      </w:rPr>
+    </w:lvl>
+    <w:lvl w:ilvl="8" w:tentative="1">
+      <w:start w:val="1"/>
+      <w:numFmt w:val="bullet"/>
+      <w:lvlText w:val=""/>
+      <w:lvlJc w:val="left"/>
+      <w:pPr>
+        <w:tabs>
+          <w:tab w:val="num" w:pos="6480"/>
+        </w:tabs>
+        <w:ind w:left="6480" w:hanging="360"/>
+      </w:pPr>
+      <w:rPr>
+        <w:rFonts w:ascii="Wingdings" w:hAnsi="Wingdings" w:hint="default"/>
+        <w:sz w:val="20"/>
+      </w:rPr>
+    </w:lvl>
+  </w:abstractNum>
+  <w:abstractNum w:abstractNumId="10" w15:restartNumberingAfterBreak="0">
+    <w:nsid w:val="43B65C3B"/>
+    <w:multiLevelType w:val="multilevel"/>
+    <w:tmpl w:val="202A3D90"/>
+    <w:lvl w:ilvl="0">
+      <w:start w:val="1"/>
+      <w:numFmt w:val="bullet"/>
+      <w:lvlText w:val=""/>
+      <w:lvlJc w:val="left"/>
+      <w:pPr>
+        <w:tabs>
+          <w:tab w:val="num" w:pos="720"/>
+        </w:tabs>
+        <w:ind w:left="720" w:hanging="360"/>
+      </w:pPr>
+      <w:rPr>
+        <w:rFonts w:ascii="Symbol" w:hAnsi="Symbol" w:hint="default"/>
+        <w:sz w:val="20"/>
+      </w:rPr>
+    </w:lvl>
+    <w:lvl w:ilvl="1" w:tentative="1">
+      <w:start w:val="1"/>
+      <w:numFmt w:val="bullet"/>
+      <w:lvlText w:val="o"/>
+      <w:lvlJc w:val="left"/>
+      <w:pPr>
+        <w:tabs>
+          <w:tab w:val="num" w:pos="1440"/>
+        </w:tabs>
+        <w:ind w:left="1440" w:hanging="360"/>
+      </w:pPr>
+      <w:rPr>
+        <w:rFonts w:ascii="Courier New" w:hAnsi="Courier New" w:hint="default"/>
+        <w:sz w:val="20"/>
+      </w:rPr>
+    </w:lvl>
+    <w:lvl w:ilvl="2" w:tentative="1">
+      <w:start w:val="1"/>
+      <w:numFmt w:val="bullet"/>
+      <w:lvlText w:val=""/>
+      <w:lvlJc w:val="left"/>
+      <w:pPr>
+        <w:tabs>
+          <w:tab w:val="num" w:pos="2160"/>
+        </w:tabs>
+        <w:ind w:left="2160" w:hanging="360"/>
+      </w:pPr>
+      <w:rPr>
+        <w:rFonts w:ascii="Wingdings" w:hAnsi="Wingdings" w:hint="default"/>
+        <w:sz w:val="20"/>
+      </w:rPr>
+    </w:lvl>
+    <w:lvl w:ilvl="3" w:tentative="1">
+      <w:start w:val="1"/>
+      <w:numFmt w:val="bullet"/>
+      <w:lvlText w:val=""/>
+      <w:lvlJc w:val="left"/>
+      <w:pPr>
+        <w:tabs>
+          <w:tab w:val="num" w:pos="2880"/>
+        </w:tabs>
+        <w:ind w:left="2880" w:hanging="360"/>
+      </w:pPr>
+      <w:rPr>
+        <w:rFonts w:ascii="Wingdings" w:hAnsi="Wingdings" w:hint="default"/>
+        <w:sz w:val="20"/>
+      </w:rPr>
+    </w:lvl>
+    <w:lvl w:ilvl="4" w:tentative="1">
+      <w:start w:val="1"/>
+      <w:numFmt w:val="bullet"/>
+      <w:lvlText w:val=""/>
+      <w:lvlJc w:val="left"/>
+      <w:pPr>
+        <w:tabs>
+          <w:tab w:val="num" w:pos="3600"/>
+        </w:tabs>
+        <w:ind w:left="3600" w:hanging="360"/>
+      </w:pPr>
+      <w:rPr>
+        <w:rFonts w:ascii="Wingdings" w:hAnsi="Wingdings" w:hint="default"/>
+        <w:sz w:val="20"/>
+      </w:rPr>
+    </w:lvl>
+    <w:lvl w:ilvl="5" w:tentative="1">
+      <w:start w:val="1"/>
+      <w:numFmt w:val="bullet"/>
+      <w:lvlText w:val=""/>
+      <w:lvlJc w:val="left"/>
+      <w:pPr>
+        <w:tabs>
+          <w:tab w:val="num" w:pos="4320"/>
+        </w:tabs>
+        <w:ind w:left="4320" w:hanging="360"/>
+      </w:pPr>
+      <w:rPr>
+        <w:rFonts w:ascii="Wingdings" w:hAnsi="Wingdings" w:hint="default"/>
+        <w:sz w:val="20"/>
+      </w:rPr>
+    </w:lvl>
+    <w:lvl w:ilvl="6" w:tentative="1">
+      <w:start w:val="1"/>
+      <w:numFmt w:val="bullet"/>
+      <w:lvlText w:val=""/>
+      <w:lvlJc w:val="left"/>
+      <w:pPr>
+        <w:tabs>
+          <w:tab w:val="num" w:pos="5040"/>
+        </w:tabs>
+        <w:ind w:left="5040" w:hanging="360"/>
+      </w:pPr>
+      <w:rPr>
+        <w:rFonts w:ascii="Wingdings" w:hAnsi="Wingdings" w:hint="default"/>
+        <w:sz w:val="20"/>
+      </w:rPr>
+    </w:lvl>
+    <w:lvl w:ilvl="7" w:tentative="1">
+      <w:start w:val="1"/>
+      <w:numFmt w:val="bullet"/>
+      <w:lvlText w:val=""/>
+      <w:lvlJc w:val="left"/>
+      <w:pPr>
+        <w:tabs>
+          <w:tab w:val="num" w:pos="5760"/>
+        </w:tabs>
+        <w:ind w:left="5760" w:hanging="360"/>
+      </w:pPr>
+      <w:rPr>
+        <w:rFonts w:ascii="Wingdings" w:hAnsi="Wingdings" w:hint="default"/>
+        <w:sz w:val="20"/>
+      </w:rPr>
+    </w:lvl>
+    <w:lvl w:ilvl="8" w:tentative="1">
+      <w:start w:val="1"/>
+      <w:numFmt w:val="bullet"/>
+      <w:lvlText w:val=""/>
+      <w:lvlJc w:val="left"/>
+      <w:pPr>
+        <w:tabs>
+          <w:tab w:val="num" w:pos="6480"/>
+        </w:tabs>
+        <w:ind w:left="6480" w:hanging="360"/>
+      </w:pPr>
+      <w:rPr>
+        <w:rFonts w:ascii="Wingdings" w:hAnsi="Wingdings" w:hint="default"/>
+        <w:sz w:val="20"/>
+      </w:rPr>
+    </w:lvl>
+  </w:abstractNum>
+  <w:abstractNum w:abstractNumId="11" w15:restartNumberingAfterBreak="0">
+    <w:nsid w:val="481807A2"/>
+    <w:multiLevelType w:val="multilevel"/>
+    <w:tmpl w:val="F59ACA78"/>
+    <w:lvl w:ilvl="0">
+      <w:start w:val="1"/>
+      <w:numFmt w:val="bullet"/>
+      <w:lvlText w:val=""/>
+      <w:lvlJc w:val="left"/>
+      <w:pPr>
+        <w:tabs>
+          <w:tab w:val="num" w:pos="720"/>
+        </w:tabs>
+        <w:ind w:left="720" w:hanging="360"/>
+      </w:pPr>
+      <w:rPr>
+        <w:rFonts w:ascii="Symbol" w:hAnsi="Symbol" w:hint="default"/>
+        <w:sz w:val="20"/>
+      </w:rPr>
+    </w:lvl>
+    <w:lvl w:ilvl="1" w:tentative="1">
+      <w:start w:val="1"/>
+      <w:numFmt w:val="bullet"/>
+      <w:lvlText w:val="o"/>
+      <w:lvlJc w:val="left"/>
+      <w:pPr>
+        <w:tabs>
+          <w:tab w:val="num" w:pos="1440"/>
+        </w:tabs>
+        <w:ind w:left="1440" w:hanging="360"/>
+      </w:pPr>
+      <w:rPr>
+        <w:rFonts w:ascii="Courier New" w:hAnsi="Courier New" w:hint="default"/>
+        <w:sz w:val="20"/>
+      </w:rPr>
+    </w:lvl>
+    <w:lvl w:ilvl="2" w:tentative="1">
+      <w:start w:val="1"/>
+      <w:numFmt w:val="bullet"/>
+      <w:lvlText w:val=""/>
+      <w:lvlJc w:val="left"/>
+      <w:pPr>
+        <w:tabs>
+          <w:tab w:val="num" w:pos="2160"/>
+        </w:tabs>
+        <w:ind w:left="2160" w:hanging="360"/>
+      </w:pPr>
+      <w:rPr>
+        <w:rFonts w:ascii="Wingdings" w:hAnsi="Wingdings" w:hint="default"/>
+        <w:sz w:val="20"/>
+      </w:rPr>
+    </w:lvl>
+    <w:lvl w:ilvl="3" w:tentative="1">
+      <w:start w:val="1"/>
+      <w:numFmt w:val="bullet"/>
+      <w:lvlText w:val=""/>
+      <w:lvlJc w:val="left"/>
+      <w:pPr>
+        <w:tabs>
+          <w:tab w:val="num" w:pos="2880"/>
+        </w:tabs>
+        <w:ind w:left="2880" w:hanging="360"/>
+      </w:pPr>
+      <w:rPr>
+        <w:rFonts w:ascii="Wingdings" w:hAnsi="Wingdings" w:hint="default"/>
+        <w:sz w:val="20"/>
+      </w:rPr>
+    </w:lvl>
+    <w:lvl w:ilvl="4" w:tentative="1">
+      <w:start w:val="1"/>
+      <w:numFmt w:val="bullet"/>
+      <w:lvlText w:val=""/>
+      <w:lvlJc w:val="left"/>
+      <w:pPr>
+        <w:tabs>
+          <w:tab w:val="num" w:pos="3600"/>
+        </w:tabs>
+        <w:ind w:left="3600" w:hanging="360"/>
+      </w:pPr>
+      <w:rPr>
+        <w:rFonts w:ascii="Wingdings" w:hAnsi="Wingdings" w:hint="default"/>
+        <w:sz w:val="20"/>
+      </w:rPr>
+    </w:lvl>
+    <w:lvl w:ilvl="5" w:tentative="1">
+      <w:start w:val="1"/>
+      <w:numFmt w:val="bullet"/>
+      <w:lvlText w:val=""/>
+      <w:lvlJc w:val="left"/>
+      <w:pPr>
+        <w:tabs>
+          <w:tab w:val="num" w:pos="4320"/>
+        </w:tabs>
+        <w:ind w:left="4320" w:hanging="360"/>
+      </w:pPr>
+      <w:rPr>
+        <w:rFonts w:ascii="Wingdings" w:hAnsi="Wingdings" w:hint="default"/>
+        <w:sz w:val="20"/>
+      </w:rPr>
+    </w:lvl>
+    <w:lvl w:ilvl="6" w:tentative="1">
+      <w:start w:val="1"/>
+      <w:numFmt w:val="bullet"/>
+      <w:lvlText w:val=""/>
+      <w:lvlJc w:val="left"/>
+      <w:pPr>
+        <w:tabs>
+          <w:tab w:val="num" w:pos="5040"/>
+        </w:tabs>
+        <w:ind w:left="5040" w:hanging="360"/>
+      </w:pPr>
+      <w:rPr>
+        <w:rFonts w:ascii="Wingdings" w:hAnsi="Wingdings" w:hint="default"/>
+        <w:sz w:val="20"/>
+      </w:rPr>
+    </w:lvl>
+    <w:lvl w:ilvl="7" w:tentative="1">
+      <w:start w:val="1"/>
+      <w:numFmt w:val="bullet"/>
+      <w:lvlText w:val=""/>
+      <w:lvlJc w:val="left"/>
+      <w:pPr>
+        <w:tabs>
+          <w:tab w:val="num" w:pos="5760"/>
+        </w:tabs>
+        <w:ind w:left="5760" w:hanging="360"/>
+      </w:pPr>
+      <w:rPr>
+        <w:rFonts w:ascii="Wingdings" w:hAnsi="Wingdings" w:hint="default"/>
+        <w:sz w:val="20"/>
+      </w:rPr>
+    </w:lvl>
+    <w:lvl w:ilvl="8" w:tentative="1">
+      <w:start w:val="1"/>
+      <w:numFmt w:val="bullet"/>
+      <w:lvlText w:val=""/>
+      <w:lvlJc w:val="left"/>
+      <w:pPr>
+        <w:tabs>
+          <w:tab w:val="num" w:pos="6480"/>
+        </w:tabs>
+        <w:ind w:left="6480" w:hanging="360"/>
+      </w:pPr>
+      <w:rPr>
+        <w:rFonts w:ascii="Wingdings" w:hAnsi="Wingdings" w:hint="default"/>
+        <w:sz w:val="20"/>
+      </w:rPr>
+    </w:lvl>
+  </w:abstractNum>
+  <w:abstractNum w:abstractNumId="12" w15:restartNumberingAfterBreak="0">
+    <w:nsid w:val="4F0B31BD"/>
+    <w:multiLevelType w:val="multilevel"/>
+    <w:tmpl w:val="9FBC56A4"/>
+    <w:lvl w:ilvl="0">
+      <w:start w:val="5"/>
+      <w:numFmt w:val="decimal"/>
+      <w:lvlText w:val="%1."/>
+      <w:lvlJc w:val="left"/>
+      <w:pPr>
+        <w:tabs>
+          <w:tab w:val="num" w:pos="720"/>
+        </w:tabs>
+        <w:ind w:left="720" w:hanging="360"/>
+      </w:pPr>
+    </w:lvl>
+    <w:lvl w:ilvl="1" w:tentative="1">
+      <w:start w:val="1"/>
+      <w:numFmt w:val="decimal"/>
+      <w:lvlText w:val="%2."/>
+      <w:lvlJc w:val="left"/>
+      <w:pPr>
+        <w:tabs>
+          <w:tab w:val="num" w:pos="1440"/>
+        </w:tabs>
+        <w:ind w:left="1440" w:hanging="360"/>
+      </w:pPr>
+    </w:lvl>
+    <w:lvl w:ilvl="2" w:tentative="1">
+      <w:start w:val="1"/>
+      <w:numFmt w:val="decimal"/>
+      <w:lvlText w:val="%3."/>
+      <w:lvlJc w:val="left"/>
+      <w:pPr>
+        <w:tabs>
+          <w:tab w:val="num" w:pos="2160"/>
+        </w:tabs>
+        <w:ind w:left="2160" w:hanging="360"/>
+      </w:pPr>
+    </w:lvl>
+    <w:lvl w:ilvl="3" w:tentative="1">
+      <w:start w:val="1"/>
+      <w:numFmt w:val="decimal"/>
+      <w:lvlText w:val="%4."/>
+      <w:lvlJc w:val="left"/>
+      <w:pPr>
+        <w:tabs>
+          <w:tab w:val="num" w:pos="2880"/>
+        </w:tabs>
+        <w:ind w:left="2880" w:hanging="360"/>
+      </w:pPr>
+    </w:lvl>
+    <w:lvl w:ilvl="4" w:tentative="1">
+      <w:start w:val="1"/>
+      <w:numFmt w:val="decimal"/>
+      <w:lvlText w:val="%5."/>
+      <w:lvlJc w:val="left"/>
+      <w:pPr>
+        <w:tabs>
+          <w:tab w:val="num" w:pos="3600"/>
+        </w:tabs>
+        <w:ind w:left="3600" w:hanging="360"/>
+      </w:pPr>
+    </w:lvl>
+    <w:lvl w:ilvl="5" w:tentative="1">
+      <w:start w:val="1"/>
+      <w:numFmt w:val="decimal"/>
+      <w:lvlText w:val="%6."/>
+      <w:lvlJc w:val="left"/>
+      <w:pPr>
+        <w:tabs>
+          <w:tab w:val="num" w:pos="4320"/>
+        </w:tabs>
+        <w:ind w:left="4320" w:hanging="360"/>
+      </w:pPr>
+    </w:lvl>
+    <w:lvl w:ilvl="6" w:tentative="1">
+      <w:start w:val="1"/>
+      <w:numFmt w:val="decimal"/>
+      <w:lvlText w:val="%7."/>
+      <w:lvlJc w:val="left"/>
+      <w:pPr>
+        <w:tabs>
+          <w:tab w:val="num" w:pos="5040"/>
+        </w:tabs>
+        <w:ind w:left="5040" w:hanging="360"/>
+      </w:pPr>
+    </w:lvl>
+    <w:lvl w:ilvl="7" w:tentative="1">
+      <w:start w:val="1"/>
+      <w:numFmt w:val="decimal"/>
+      <w:lvlText w:val="%8."/>
+      <w:lvlJc w:val="left"/>
+      <w:pPr>
+        <w:tabs>
+          <w:tab w:val="num" w:pos="5760"/>
+        </w:tabs>
+        <w:ind w:left="5760" w:hanging="360"/>
+      </w:pPr>
+    </w:lvl>
+    <w:lvl w:ilvl="8" w:tentative="1">
+      <w:start w:val="1"/>
+      <w:numFmt w:val="decimal"/>
+      <w:lvlText w:val="%9."/>
+      <w:lvlJc w:val="left"/>
+      <w:pPr>
+        <w:tabs>
+          <w:tab w:val="num" w:pos="6480"/>
+        </w:tabs>
+        <w:ind w:left="6480" w:hanging="360"/>
+      </w:pPr>
+    </w:lvl>
+  </w:abstractNum>
+  <w:abstractNum w:abstractNumId="13" w15:restartNumberingAfterBreak="0">
+    <w:nsid w:val="51B838A5"/>
+    <w:multiLevelType w:val="multilevel"/>
+    <w:tmpl w:val="9500BF0A"/>
+    <w:lvl w:ilvl="0">
+      <w:start w:val="1"/>
+      <w:numFmt w:val="bullet"/>
+      <w:lvlText w:val=""/>
+      <w:lvlJc w:val="left"/>
+      <w:pPr>
+        <w:tabs>
+          <w:tab w:val="num" w:pos="720"/>
+        </w:tabs>
+        <w:ind w:left="720" w:hanging="360"/>
+      </w:pPr>
+      <w:rPr>
+        <w:rFonts w:ascii="Symbol" w:hAnsi="Symbol" w:hint="default"/>
+        <w:sz w:val="20"/>
+      </w:rPr>
+    </w:lvl>
+    <w:lvl w:ilvl="1" w:tentative="1">
+      <w:start w:val="1"/>
+      <w:numFmt w:val="bullet"/>
+      <w:lvlText w:val="o"/>
+      <w:lvlJc w:val="left"/>
+      <w:pPr>
+        <w:tabs>
+          <w:tab w:val="num" w:pos="1440"/>
+        </w:tabs>
+        <w:ind w:left="1440" w:hanging="360"/>
+      </w:pPr>
+      <w:rPr>
+        <w:rFonts w:ascii="Courier New" w:hAnsi="Courier New" w:hint="default"/>
+        <w:sz w:val="20"/>
+      </w:rPr>
+    </w:lvl>
+    <w:lvl w:ilvl="2" w:tentative="1">
+      <w:start w:val="1"/>
+      <w:numFmt w:val="bullet"/>
+      <w:lvlText w:val=""/>
+      <w:lvlJc w:val="left"/>
+      <w:pPr>
+        <w:tabs>
+          <w:tab w:val="num" w:pos="2160"/>
+        </w:tabs>
+        <w:ind w:left="2160" w:hanging="360"/>
+      </w:pPr>
+      <w:rPr>
+        <w:rFonts w:ascii="Wingdings" w:hAnsi="Wingdings" w:hint="default"/>
+        <w:sz w:val="20"/>
+      </w:rPr>
+    </w:lvl>
+    <w:lvl w:ilvl="3" w:tentative="1">
+      <w:start w:val="1"/>
+      <w:numFmt w:val="bullet"/>
+      <w:lvlText w:val=""/>
+      <w:lvlJc w:val="left"/>
+      <w:pPr>
+        <w:tabs>
+          <w:tab w:val="num" w:pos="2880"/>
+        </w:tabs>
+        <w:ind w:left="2880" w:hanging="360"/>
+      </w:pPr>
+      <w:rPr>
+        <w:rFonts w:ascii="Wingdings" w:hAnsi="Wingdings" w:hint="default"/>
+        <w:sz w:val="20"/>
+      </w:rPr>
+    </w:lvl>
+    <w:lvl w:ilvl="4" w:tentative="1">
+      <w:start w:val="1"/>
+      <w:numFmt w:val="bullet"/>
+      <w:lvlText w:val=""/>
+      <w:lvlJc w:val="left"/>
+      <w:pPr>
+        <w:tabs>
+          <w:tab w:val="num" w:pos="3600"/>
+        </w:tabs>
+        <w:ind w:left="3600" w:hanging="360"/>
+      </w:pPr>
+      <w:rPr>
+        <w:rFonts w:ascii="Wingdings" w:hAnsi="Wingdings" w:hint="default"/>
+        <w:sz w:val="20"/>
+      </w:rPr>
+    </w:lvl>
+    <w:lvl w:ilvl="5" w:tentative="1">
+      <w:start w:val="1"/>
+      <w:numFmt w:val="bullet"/>
+      <w:lvlText w:val=""/>
+      <w:lvlJc w:val="left"/>
+      <w:pPr>
+        <w:tabs>
+          <w:tab w:val="num" w:pos="4320"/>
+        </w:tabs>
+        <w:ind w:left="4320" w:hanging="360"/>
+      </w:pPr>
+      <w:rPr>
+        <w:rFonts w:ascii="Wingdings" w:hAnsi="Wingdings" w:hint="default"/>
+        <w:sz w:val="20"/>
+      </w:rPr>
+    </w:lvl>
+    <w:lvl w:ilvl="6" w:tentative="1">
+      <w:start w:val="1"/>
+      <w:numFmt w:val="bullet"/>
+      <w:lvlText w:val=""/>
+      <w:lvlJc w:val="left"/>
+      <w:pPr>
+        <w:tabs>
+          <w:tab w:val="num" w:pos="5040"/>
+        </w:tabs>
+        <w:ind w:left="5040" w:hanging="360"/>
+      </w:pPr>
+      <w:rPr>
+        <w:rFonts w:ascii="Wingdings" w:hAnsi="Wingdings" w:hint="default"/>
+        <w:sz w:val="20"/>
+      </w:rPr>
+    </w:lvl>
+    <w:lvl w:ilvl="7" w:tentative="1">
+      <w:start w:val="1"/>
+      <w:numFmt w:val="bullet"/>
+      <w:lvlText w:val=""/>
+      <w:lvlJc w:val="left"/>
+      <w:pPr>
+        <w:tabs>
+          <w:tab w:val="num" w:pos="5760"/>
+        </w:tabs>
+        <w:ind w:left="5760" w:hanging="360"/>
+      </w:pPr>
+      <w:rPr>
+        <w:rFonts w:ascii="Wingdings" w:hAnsi="Wingdings" w:hint="default"/>
+        <w:sz w:val="20"/>
+      </w:rPr>
+    </w:lvl>
+    <w:lvl w:ilvl="8" w:tentative="1">
+      <w:start w:val="1"/>
+      <w:numFmt w:val="bullet"/>
+      <w:lvlText w:val=""/>
+      <w:lvlJc w:val="left"/>
+      <w:pPr>
+        <w:tabs>
+          <w:tab w:val="num" w:pos="6480"/>
+        </w:tabs>
+        <w:ind w:left="6480" w:hanging="360"/>
+      </w:pPr>
+      <w:rPr>
+        <w:rFonts w:ascii="Wingdings" w:hAnsi="Wingdings" w:hint="default"/>
+        <w:sz w:val="20"/>
+      </w:rPr>
+    </w:lvl>
+  </w:abstractNum>
+  <w:abstractNum w:abstractNumId="14" w15:restartNumberingAfterBreak="0">
     <w:nsid w:val="52AE19E4"/>
     <w:multiLevelType w:val="hybridMultilevel"/>
     <w:tmpl w:val="0CC066E2"/>
@@ -851,7 +4621,120 @@
       </w:rPr>
     </w:lvl>
   </w:abstractNum>
-  <w:abstractNum w:abstractNumId="3" w15:restartNumberingAfterBreak="0">
+  <w:abstractNum w:abstractNumId="15" w15:restartNumberingAfterBreak="0">
+    <w:nsid w:val="533E271B"/>
+    <w:multiLevelType w:val="multilevel"/>
+    <w:tmpl w:val="C840C844"/>
+    <w:lvl w:ilvl="0">
+      <w:start w:val="7"/>
+      <w:numFmt w:val="decimal"/>
+      <w:lvlText w:val="%1."/>
+      <w:lvlJc w:val="left"/>
+      <w:pPr>
+        <w:tabs>
+          <w:tab w:val="num" w:pos="720"/>
+        </w:tabs>
+        <w:ind w:left="720" w:hanging="360"/>
+      </w:pPr>
+    </w:lvl>
+    <w:lvl w:ilvl="1" w:tentative="1">
+      <w:start w:val="1"/>
+      <w:numFmt w:val="decimal"/>
+      <w:lvlText w:val="%2."/>
+      <w:lvlJc w:val="left"/>
+      <w:pPr>
+        <w:tabs>
+          <w:tab w:val="num" w:pos="1440"/>
+        </w:tabs>
+        <w:ind w:left="1440" w:hanging="360"/>
+      </w:pPr>
+    </w:lvl>
+    <w:lvl w:ilvl="2" w:tentative="1">
+      <w:start w:val="1"/>
+      <w:numFmt w:val="decimal"/>
+      <w:lvlText w:val="%3."/>
+      <w:lvlJc w:val="left"/>
+      <w:pPr>
+        <w:tabs>
+          <w:tab w:val="num" w:pos="2160"/>
+        </w:tabs>
+        <w:ind w:left="2160" w:hanging="360"/>
+      </w:pPr>
+    </w:lvl>
+    <w:lvl w:ilvl="3" w:tentative="1">
+      <w:start w:val="1"/>
+      <w:numFmt w:val="decimal"/>
+      <w:lvlText w:val="%4."/>
+      <w:lvlJc w:val="left"/>
+      <w:pPr>
+        <w:tabs>
+          <w:tab w:val="num" w:pos="2880"/>
+        </w:tabs>
+        <w:ind w:left="2880" w:hanging="360"/>
+      </w:pPr>
+    </w:lvl>
+    <w:lvl w:ilvl="4" w:tentative="1">
+      <w:start w:val="1"/>
+      <w:numFmt w:val="decimal"/>
+      <w:lvlText w:val="%5."/>
+      <w:lvlJc w:val="left"/>
+      <w:pPr>
+        <w:tabs>
+          <w:tab w:val="num" w:pos="3600"/>
+        </w:tabs>
+        <w:ind w:left="3600" w:hanging="360"/>
+      </w:pPr>
+    </w:lvl>
+    <w:lvl w:ilvl="5" w:tentative="1">
+      <w:start w:val="1"/>
+      <w:numFmt w:val="decimal"/>
+      <w:lvlText w:val="%6."/>
+      <w:lvlJc w:val="left"/>
+      <w:pPr>
+        <w:tabs>
+          <w:tab w:val="num" w:pos="4320"/>
+        </w:tabs>
+        <w:ind w:left="4320" w:hanging="360"/>
+      </w:pPr>
+    </w:lvl>
+    <w:lvl w:ilvl="6" w:tentative="1">
+      <w:start w:val="1"/>
+      <w:numFmt w:val="decimal"/>
+      <w:lvlText w:val="%7."/>
+      <w:lvlJc w:val="left"/>
+      <w:pPr>
+        <w:tabs>
+          <w:tab w:val="num" w:pos="5040"/>
+        </w:tabs>
+        <w:ind w:left="5040" w:hanging="360"/>
+      </w:pPr>
+    </w:lvl>
+    <w:lvl w:ilvl="7" w:tentative="1">
+      <w:start w:val="1"/>
+      <w:numFmt w:val="decimal"/>
+      <w:lvlText w:val="%8."/>
+      <w:lvlJc w:val="left"/>
+      <w:pPr>
+        <w:tabs>
+          <w:tab w:val="num" w:pos="5760"/>
+        </w:tabs>
+        <w:ind w:left="5760" w:hanging="360"/>
+      </w:pPr>
+    </w:lvl>
+    <w:lvl w:ilvl="8" w:tentative="1">
+      <w:start w:val="1"/>
+      <w:numFmt w:val="decimal"/>
+      <w:lvlText w:val="%9."/>
+      <w:lvlJc w:val="left"/>
+      <w:pPr>
+        <w:tabs>
+          <w:tab w:val="num" w:pos="6480"/>
+        </w:tabs>
+        <w:ind w:left="6480" w:hanging="360"/>
+      </w:pPr>
+    </w:lvl>
+  </w:abstractNum>
+  <w:abstractNum w:abstractNumId="16" w15:restartNumberingAfterBreak="0">
     <w:nsid w:val="55415916"/>
     <w:multiLevelType w:val="hybridMultilevel"/>
     <w:tmpl w:val="D0F28D02"/>
@@ -964,7 +4847,7 @@
       </w:rPr>
     </w:lvl>
   </w:abstractNum>
-  <w:abstractNum w:abstractNumId="4" w15:restartNumberingAfterBreak="0">
+  <w:abstractNum w:abstractNumId="17" w15:restartNumberingAfterBreak="0">
     <w:nsid w:val="56E3102A"/>
     <w:multiLevelType w:val="hybridMultilevel"/>
     <w:tmpl w:val="B9604B16"/>
@@ -1050,7 +4933,7 @@
       </w:pPr>
     </w:lvl>
   </w:abstractNum>
-  <w:abstractNum w:abstractNumId="5" w15:restartNumberingAfterBreak="0">
+  <w:abstractNum w:abstractNumId="18" w15:restartNumberingAfterBreak="0">
     <w:nsid w:val="5D0C57EF"/>
     <w:multiLevelType w:val="hybridMultilevel"/>
     <w:tmpl w:val="4FD877EE"/>
@@ -1136,7 +5019,382 @@
       </w:pPr>
     </w:lvl>
   </w:abstractNum>
-  <w:abstractNum w:abstractNumId="6" w15:restartNumberingAfterBreak="0">
+  <w:abstractNum w:abstractNumId="19" w15:restartNumberingAfterBreak="0">
+    <w:nsid w:val="5F4B063A"/>
+    <w:multiLevelType w:val="multilevel"/>
+    <w:tmpl w:val="1658A9A8"/>
+    <w:lvl w:ilvl="0">
+      <w:start w:val="1"/>
+      <w:numFmt w:val="bullet"/>
+      <w:lvlText w:val=""/>
+      <w:lvlJc w:val="left"/>
+      <w:pPr>
+        <w:tabs>
+          <w:tab w:val="num" w:pos="720"/>
+        </w:tabs>
+        <w:ind w:left="720" w:hanging="360"/>
+      </w:pPr>
+      <w:rPr>
+        <w:rFonts w:ascii="Symbol" w:hAnsi="Symbol" w:hint="default"/>
+        <w:sz w:val="20"/>
+      </w:rPr>
+    </w:lvl>
+    <w:lvl w:ilvl="1" w:tentative="1">
+      <w:start w:val="1"/>
+      <w:numFmt w:val="bullet"/>
+      <w:lvlText w:val="o"/>
+      <w:lvlJc w:val="left"/>
+      <w:pPr>
+        <w:tabs>
+          <w:tab w:val="num" w:pos="1440"/>
+        </w:tabs>
+        <w:ind w:left="1440" w:hanging="360"/>
+      </w:pPr>
+      <w:rPr>
+        <w:rFonts w:ascii="Courier New" w:hAnsi="Courier New" w:hint="default"/>
+        <w:sz w:val="20"/>
+      </w:rPr>
+    </w:lvl>
+    <w:lvl w:ilvl="2" w:tentative="1">
+      <w:start w:val="1"/>
+      <w:numFmt w:val="bullet"/>
+      <w:lvlText w:val=""/>
+      <w:lvlJc w:val="left"/>
+      <w:pPr>
+        <w:tabs>
+          <w:tab w:val="num" w:pos="2160"/>
+        </w:tabs>
+        <w:ind w:left="2160" w:hanging="360"/>
+      </w:pPr>
+      <w:rPr>
+        <w:rFonts w:ascii="Wingdings" w:hAnsi="Wingdings" w:hint="default"/>
+        <w:sz w:val="20"/>
+      </w:rPr>
+    </w:lvl>
+    <w:lvl w:ilvl="3" w:tentative="1">
+      <w:start w:val="1"/>
+      <w:numFmt w:val="bullet"/>
+      <w:lvlText w:val=""/>
+      <w:lvlJc w:val="left"/>
+      <w:pPr>
+        <w:tabs>
+          <w:tab w:val="num" w:pos="2880"/>
+        </w:tabs>
+        <w:ind w:left="2880" w:hanging="360"/>
+      </w:pPr>
+      <w:rPr>
+        <w:rFonts w:ascii="Wingdings" w:hAnsi="Wingdings" w:hint="default"/>
+        <w:sz w:val="20"/>
+      </w:rPr>
+    </w:lvl>
+    <w:lvl w:ilvl="4" w:tentative="1">
+      <w:start w:val="1"/>
+      <w:numFmt w:val="bullet"/>
+      <w:lvlText w:val=""/>
+      <w:lvlJc w:val="left"/>
+      <w:pPr>
+        <w:tabs>
+          <w:tab w:val="num" w:pos="3600"/>
+        </w:tabs>
+        <w:ind w:left="3600" w:hanging="360"/>
+      </w:pPr>
+      <w:rPr>
+        <w:rFonts w:ascii="Wingdings" w:hAnsi="Wingdings" w:hint="default"/>
+        <w:sz w:val="20"/>
+      </w:rPr>
+    </w:lvl>
+    <w:lvl w:ilvl="5" w:tentative="1">
+      <w:start w:val="1"/>
+      <w:numFmt w:val="bullet"/>
+      <w:lvlText w:val=""/>
+      <w:lvlJc w:val="left"/>
+      <w:pPr>
+        <w:tabs>
+          <w:tab w:val="num" w:pos="4320"/>
+        </w:tabs>
+        <w:ind w:left="4320" w:hanging="360"/>
+      </w:pPr>
+      <w:rPr>
+        <w:rFonts w:ascii="Wingdings" w:hAnsi="Wingdings" w:hint="default"/>
+        <w:sz w:val="20"/>
+      </w:rPr>
+    </w:lvl>
+    <w:lvl w:ilvl="6" w:tentative="1">
+      <w:start w:val="1"/>
+      <w:numFmt w:val="bullet"/>
+      <w:lvlText w:val=""/>
+      <w:lvlJc w:val="left"/>
+      <w:pPr>
+        <w:tabs>
+          <w:tab w:val="num" w:pos="5040"/>
+        </w:tabs>
+        <w:ind w:left="5040" w:hanging="360"/>
+      </w:pPr>
+      <w:rPr>
+        <w:rFonts w:ascii="Wingdings" w:hAnsi="Wingdings" w:hint="default"/>
+        <w:sz w:val="20"/>
+      </w:rPr>
+    </w:lvl>
+    <w:lvl w:ilvl="7" w:tentative="1">
+      <w:start w:val="1"/>
+      <w:numFmt w:val="bullet"/>
+      <w:lvlText w:val=""/>
+      <w:lvlJc w:val="left"/>
+      <w:pPr>
+        <w:tabs>
+          <w:tab w:val="num" w:pos="5760"/>
+        </w:tabs>
+        <w:ind w:left="5760" w:hanging="360"/>
+      </w:pPr>
+      <w:rPr>
+        <w:rFonts w:ascii="Wingdings" w:hAnsi="Wingdings" w:hint="default"/>
+        <w:sz w:val="20"/>
+      </w:rPr>
+    </w:lvl>
+    <w:lvl w:ilvl="8" w:tentative="1">
+      <w:start w:val="1"/>
+      <w:numFmt w:val="bullet"/>
+      <w:lvlText w:val=""/>
+      <w:lvlJc w:val="left"/>
+      <w:pPr>
+        <w:tabs>
+          <w:tab w:val="num" w:pos="6480"/>
+        </w:tabs>
+        <w:ind w:left="6480" w:hanging="360"/>
+      </w:pPr>
+      <w:rPr>
+        <w:rFonts w:ascii="Wingdings" w:hAnsi="Wingdings" w:hint="default"/>
+        <w:sz w:val="20"/>
+      </w:rPr>
+    </w:lvl>
+  </w:abstractNum>
+  <w:abstractNum w:abstractNumId="20" w15:restartNumberingAfterBreak="0">
+    <w:nsid w:val="617A4B8C"/>
+    <w:multiLevelType w:val="multilevel"/>
+    <w:tmpl w:val="E2F6AC22"/>
+    <w:lvl w:ilvl="0">
+      <w:start w:val="4"/>
+      <w:numFmt w:val="decimal"/>
+      <w:lvlText w:val="%1."/>
+      <w:lvlJc w:val="left"/>
+      <w:pPr>
+        <w:tabs>
+          <w:tab w:val="num" w:pos="720"/>
+        </w:tabs>
+        <w:ind w:left="720" w:hanging="360"/>
+      </w:pPr>
+    </w:lvl>
+    <w:lvl w:ilvl="1" w:tentative="1">
+      <w:start w:val="1"/>
+      <w:numFmt w:val="decimal"/>
+      <w:lvlText w:val="%2."/>
+      <w:lvlJc w:val="left"/>
+      <w:pPr>
+        <w:tabs>
+          <w:tab w:val="num" w:pos="1440"/>
+        </w:tabs>
+        <w:ind w:left="1440" w:hanging="360"/>
+      </w:pPr>
+    </w:lvl>
+    <w:lvl w:ilvl="2" w:tentative="1">
+      <w:start w:val="1"/>
+      <w:numFmt w:val="decimal"/>
+      <w:lvlText w:val="%3."/>
+      <w:lvlJc w:val="left"/>
+      <w:pPr>
+        <w:tabs>
+          <w:tab w:val="num" w:pos="2160"/>
+        </w:tabs>
+        <w:ind w:left="2160" w:hanging="360"/>
+      </w:pPr>
+    </w:lvl>
+    <w:lvl w:ilvl="3" w:tentative="1">
+      <w:start w:val="1"/>
+      <w:numFmt w:val="decimal"/>
+      <w:lvlText w:val="%4."/>
+      <w:lvlJc w:val="left"/>
+      <w:pPr>
+        <w:tabs>
+          <w:tab w:val="num" w:pos="2880"/>
+        </w:tabs>
+        <w:ind w:left="2880" w:hanging="360"/>
+      </w:pPr>
+    </w:lvl>
+    <w:lvl w:ilvl="4" w:tentative="1">
+      <w:start w:val="1"/>
+      <w:numFmt w:val="decimal"/>
+      <w:lvlText w:val="%5."/>
+      <w:lvlJc w:val="left"/>
+      <w:pPr>
+        <w:tabs>
+          <w:tab w:val="num" w:pos="3600"/>
+        </w:tabs>
+        <w:ind w:left="3600" w:hanging="360"/>
+      </w:pPr>
+    </w:lvl>
+    <w:lvl w:ilvl="5" w:tentative="1">
+      <w:start w:val="1"/>
+      <w:numFmt w:val="decimal"/>
+      <w:lvlText w:val="%6."/>
+      <w:lvlJc w:val="left"/>
+      <w:pPr>
+        <w:tabs>
+          <w:tab w:val="num" w:pos="4320"/>
+        </w:tabs>
+        <w:ind w:left="4320" w:hanging="360"/>
+      </w:pPr>
+    </w:lvl>
+    <w:lvl w:ilvl="6" w:tentative="1">
+      <w:start w:val="1"/>
+      <w:numFmt w:val="decimal"/>
+      <w:lvlText w:val="%7."/>
+      <w:lvlJc w:val="left"/>
+      <w:pPr>
+        <w:tabs>
+          <w:tab w:val="num" w:pos="5040"/>
+        </w:tabs>
+        <w:ind w:left="5040" w:hanging="360"/>
+      </w:pPr>
+    </w:lvl>
+    <w:lvl w:ilvl="7" w:tentative="1">
+      <w:start w:val="1"/>
+      <w:numFmt w:val="decimal"/>
+      <w:lvlText w:val="%8."/>
+      <w:lvlJc w:val="left"/>
+      <w:pPr>
+        <w:tabs>
+          <w:tab w:val="num" w:pos="5760"/>
+        </w:tabs>
+        <w:ind w:left="5760" w:hanging="360"/>
+      </w:pPr>
+    </w:lvl>
+    <w:lvl w:ilvl="8" w:tentative="1">
+      <w:start w:val="1"/>
+      <w:numFmt w:val="decimal"/>
+      <w:lvlText w:val="%9."/>
+      <w:lvlJc w:val="left"/>
+      <w:pPr>
+        <w:tabs>
+          <w:tab w:val="num" w:pos="6480"/>
+        </w:tabs>
+        <w:ind w:left="6480" w:hanging="360"/>
+      </w:pPr>
+    </w:lvl>
+  </w:abstractNum>
+  <w:abstractNum w:abstractNumId="21" w15:restartNumberingAfterBreak="0">
+    <w:nsid w:val="772D3FB5"/>
+    <w:multiLevelType w:val="multilevel"/>
+    <w:tmpl w:val="AE1A9F92"/>
+    <w:lvl w:ilvl="0">
+      <w:start w:val="3"/>
+      <w:numFmt w:val="decimal"/>
+      <w:lvlText w:val="%1."/>
+      <w:lvlJc w:val="left"/>
+      <w:pPr>
+        <w:tabs>
+          <w:tab w:val="num" w:pos="720"/>
+        </w:tabs>
+        <w:ind w:left="720" w:hanging="360"/>
+      </w:pPr>
+    </w:lvl>
+    <w:lvl w:ilvl="1" w:tentative="1">
+      <w:start w:val="1"/>
+      <w:numFmt w:val="decimal"/>
+      <w:lvlText w:val="%2."/>
+      <w:lvlJc w:val="left"/>
+      <w:pPr>
+        <w:tabs>
+          <w:tab w:val="num" w:pos="1440"/>
+        </w:tabs>
+        <w:ind w:left="1440" w:hanging="360"/>
+      </w:pPr>
+    </w:lvl>
+    <w:lvl w:ilvl="2" w:tentative="1">
+      <w:start w:val="1"/>
+      <w:numFmt w:val="decimal"/>
+      <w:lvlText w:val="%3."/>
+      <w:lvlJc w:val="left"/>
+      <w:pPr>
+        <w:tabs>
+          <w:tab w:val="num" w:pos="2160"/>
+        </w:tabs>
+        <w:ind w:left="2160" w:hanging="360"/>
+      </w:pPr>
+    </w:lvl>
+    <w:lvl w:ilvl="3" w:tentative="1">
+      <w:start w:val="1"/>
+      <w:numFmt w:val="decimal"/>
+      <w:lvlText w:val="%4."/>
+      <w:lvlJc w:val="left"/>
+      <w:pPr>
+        <w:tabs>
+          <w:tab w:val="num" w:pos="2880"/>
+        </w:tabs>
+        <w:ind w:left="2880" w:hanging="360"/>
+      </w:pPr>
+    </w:lvl>
+    <w:lvl w:ilvl="4" w:tentative="1">
+      <w:start w:val="1"/>
+      <w:numFmt w:val="decimal"/>
+      <w:lvlText w:val="%5."/>
+      <w:lvlJc w:val="left"/>
+      <w:pPr>
+        <w:tabs>
+          <w:tab w:val="num" w:pos="3600"/>
+        </w:tabs>
+        <w:ind w:left="3600" w:hanging="360"/>
+      </w:pPr>
+    </w:lvl>
+    <w:lvl w:ilvl="5" w:tentative="1">
+      <w:start w:val="1"/>
+      <w:numFmt w:val="decimal"/>
+      <w:lvlText w:val="%6."/>
+      <w:lvlJc w:val="left"/>
+      <w:pPr>
+        <w:tabs>
+          <w:tab w:val="num" w:pos="4320"/>
+        </w:tabs>
+        <w:ind w:left="4320" w:hanging="360"/>
+      </w:pPr>
+    </w:lvl>
+    <w:lvl w:ilvl="6" w:tentative="1">
+      <w:start w:val="1"/>
+      <w:numFmt w:val="decimal"/>
+      <w:lvlText w:val="%7."/>
+      <w:lvlJc w:val="left"/>
+      <w:pPr>
+        <w:tabs>
+          <w:tab w:val="num" w:pos="5040"/>
+        </w:tabs>
+        <w:ind w:left="5040" w:hanging="360"/>
+      </w:pPr>
+    </w:lvl>
+    <w:lvl w:ilvl="7" w:tentative="1">
+      <w:start w:val="1"/>
+      <w:numFmt w:val="decimal"/>
+      <w:lvlText w:val="%8."/>
+      <w:lvlJc w:val="left"/>
+      <w:pPr>
+        <w:tabs>
+          <w:tab w:val="num" w:pos="5760"/>
+        </w:tabs>
+        <w:ind w:left="5760" w:hanging="360"/>
+      </w:pPr>
+    </w:lvl>
+    <w:lvl w:ilvl="8" w:tentative="1">
+      <w:start w:val="1"/>
+      <w:numFmt w:val="decimal"/>
+      <w:lvlText w:val="%9."/>
+      <w:lvlJc w:val="left"/>
+      <w:pPr>
+        <w:tabs>
+          <w:tab w:val="num" w:pos="6480"/>
+        </w:tabs>
+        <w:ind w:left="6480" w:hanging="360"/>
+      </w:pPr>
+    </w:lvl>
+  </w:abstractNum>
+  <w:abstractNum w:abstractNumId="22" w15:restartNumberingAfterBreak="0">
     <w:nsid w:val="78DE3088"/>
     <w:multiLevelType w:val="hybridMultilevel"/>
     <w:tmpl w:val="F996721E"/>
@@ -1250,25 +5508,73 @@
     </w:lvl>
   </w:abstractNum>
   <w:num w:numId="1" w16cid:durableId="2018917641">
+    <w:abstractNumId w:val="7"/>
+  </w:num>
+  <w:num w:numId="2" w16cid:durableId="1825319895">
     <w:abstractNumId w:val="1"/>
   </w:num>
-  <w:num w:numId="2" w16cid:durableId="1825319895">
+  <w:num w:numId="3" w16cid:durableId="315384236">
+    <w:abstractNumId w:val="17"/>
+  </w:num>
+  <w:num w:numId="4" w16cid:durableId="1938556053">
+    <w:abstractNumId w:val="14"/>
+  </w:num>
+  <w:num w:numId="5" w16cid:durableId="148207782">
+    <w:abstractNumId w:val="16"/>
+  </w:num>
+  <w:num w:numId="6" w16cid:durableId="1915163218">
+    <w:abstractNumId w:val="22"/>
+  </w:num>
+  <w:num w:numId="7" w16cid:durableId="496265612">
+    <w:abstractNumId w:val="18"/>
+  </w:num>
+  <w:num w:numId="8" w16cid:durableId="2118403121">
+    <w:abstractNumId w:val="4"/>
+  </w:num>
+  <w:num w:numId="9" w16cid:durableId="1622611413">
+    <w:abstractNumId w:val="9"/>
+  </w:num>
+  <w:num w:numId="10" w16cid:durableId="1274560748">
+    <w:abstractNumId w:val="8"/>
+  </w:num>
+  <w:num w:numId="11" w16cid:durableId="466289279">
+    <w:abstractNumId w:val="19"/>
+  </w:num>
+  <w:num w:numId="12" w16cid:durableId="98305243">
+    <w:abstractNumId w:val="21"/>
+  </w:num>
+  <w:num w:numId="13" w16cid:durableId="1026442198">
     <w:abstractNumId w:val="0"/>
   </w:num>
-  <w:num w:numId="3" w16cid:durableId="315384236">
-    <w:abstractNumId w:val="4"/>
+  <w:num w:numId="14" w16cid:durableId="328676543">
+    <w:abstractNumId w:val="20"/>
   </w:num>
-  <w:num w:numId="4" w16cid:durableId="1938556053">
+  <w:num w:numId="15" w16cid:durableId="226384987">
+    <w:abstractNumId w:val="10"/>
+  </w:num>
+  <w:num w:numId="16" w16cid:durableId="878127498">
+    <w:abstractNumId w:val="12"/>
+  </w:num>
+  <w:num w:numId="17" w16cid:durableId="156576824">
+    <w:abstractNumId w:val="11"/>
+  </w:num>
+  <w:num w:numId="18" w16cid:durableId="1150053033">
     <w:abstractNumId w:val="2"/>
   </w:num>
-  <w:num w:numId="5" w16cid:durableId="148207782">
+  <w:num w:numId="19" w16cid:durableId="276108414">
+    <w:abstractNumId w:val="6"/>
+  </w:num>
+  <w:num w:numId="20" w16cid:durableId="683096758">
+    <w:abstractNumId w:val="15"/>
+  </w:num>
+  <w:num w:numId="21" w16cid:durableId="1423649141">
     <w:abstractNumId w:val="3"/>
   </w:num>
-  <w:num w:numId="6" w16cid:durableId="1915163218">
-    <w:abstractNumId w:val="6"/>
+  <w:num w:numId="22" w16cid:durableId="185560209">
+    <w:abstractNumId w:val="5"/>
   </w:num>
-  <w:num w:numId="7" w16cid:durableId="496265612">
-    <w:abstractNumId w:val="5"/>
+  <w:num w:numId="23" w16cid:durableId="838815670">
+    <w:abstractNumId w:val="13"/>
   </w:num>
 </w:numbering>
 </file>

</xml_diff>